<commit_message>
modified:   Documentacion Panel CS/Documentacion Panel CS.docx
</commit_message>
<xml_diff>
--- a/Documentacion Panel CS/Documentacion Panel CS.docx
+++ b/Documentacion Panel CS/Documentacion Panel CS.docx
@@ -70,7 +70,7 @@
           <w:pPr>
             <w:pStyle w:val="TDC1"/>
             <w:tabs>
-              <w:tab w:val="right" w:leader="dot" w:pos="12996"/>
+              <w:tab w:val="right" w:leader="dot" w:pos="8828"/>
             </w:tabs>
             <w:rPr>
               <w:rFonts w:eastAsiaTheme="minorEastAsia"/>
@@ -96,7 +96,7 @@
             </w:rPr>
             <w:fldChar w:fldCharType="separate"/>
           </w:r>
-          <w:hyperlink w:anchor="_Toc241765566" w:history="1">
+          <w:hyperlink w:anchor="_Toc242456213" w:history="1">
             <w:r>
               <w:rPr>
                 <w:rStyle w:val="Hipervnculo"/>
@@ -124,7 +124,7 @@
                 <w:noProof/>
                 <w:webHidden/>
               </w:rPr>
-              <w:instrText xml:space="preserve"> PAGEREF _Toc241765566 \h </w:instrText>
+              <w:instrText xml:space="preserve"> PAGEREF _Toc242456213 \h </w:instrText>
             </w:r>
             <w:r>
               <w:rPr>
@@ -144,7 +144,7 @@
                 <w:noProof/>
                 <w:webHidden/>
               </w:rPr>
-              <w:t>4</w:t>
+              <w:t>3</w:t>
             </w:r>
             <w:r>
               <w:rPr>
@@ -159,7 +159,7 @@
           <w:pPr>
             <w:pStyle w:val="TDC1"/>
             <w:tabs>
-              <w:tab w:val="right" w:leader="dot" w:pos="12996"/>
+              <w:tab w:val="right" w:leader="dot" w:pos="8828"/>
             </w:tabs>
             <w:rPr>
               <w:rFonts w:eastAsiaTheme="minorEastAsia"/>
@@ -167,7 +167,7 @@
               <w:lang w:eastAsia="es-MX"/>
             </w:rPr>
           </w:pPr>
-          <w:hyperlink w:anchor="_Toc241765567" w:history="1">
+          <w:hyperlink w:anchor="_Toc242456214" w:history="1">
             <w:r>
               <w:rPr>
                 <w:rStyle w:val="Hipervnculo"/>
@@ -195,7 +195,7 @@
                 <w:noProof/>
                 <w:webHidden/>
               </w:rPr>
-              <w:instrText xml:space="preserve"> PAGEREF _Toc241765567 \h </w:instrText>
+              <w:instrText xml:space="preserve"> PAGEREF _Toc242456214 \h </w:instrText>
             </w:r>
             <w:r>
               <w:rPr>
@@ -215,7 +215,7 @@
                 <w:noProof/>
                 <w:webHidden/>
               </w:rPr>
-              <w:t>5</w:t>
+              <w:t>4</w:t>
             </w:r>
             <w:r>
               <w:rPr>
@@ -230,7 +230,7 @@
           <w:pPr>
             <w:pStyle w:val="TDC1"/>
             <w:tabs>
-              <w:tab w:val="right" w:leader="dot" w:pos="12996"/>
+              <w:tab w:val="right" w:leader="dot" w:pos="8828"/>
             </w:tabs>
             <w:rPr>
               <w:rFonts w:eastAsiaTheme="minorEastAsia"/>
@@ -238,7 +238,7 @@
               <w:lang w:eastAsia="es-MX"/>
             </w:rPr>
           </w:pPr>
-          <w:hyperlink w:anchor="_Toc241765568" w:history="1">
+          <w:hyperlink w:anchor="_Toc242456215" w:history="1">
             <w:r>
               <w:rPr>
                 <w:rStyle w:val="Hipervnculo"/>
@@ -266,7 +266,7 @@
                 <w:noProof/>
                 <w:webHidden/>
               </w:rPr>
-              <w:instrText xml:space="preserve"> PAGEREF _Toc241765568 \h </w:instrText>
+              <w:instrText xml:space="preserve"> PAGEREF _Toc242456215 \h </w:instrText>
             </w:r>
             <w:r>
               <w:rPr>
@@ -286,7 +286,7 @@
                 <w:noProof/>
                 <w:webHidden/>
               </w:rPr>
-              <w:t>6</w:t>
+              <w:t>5</w:t>
             </w:r>
             <w:r>
               <w:rPr>
@@ -301,7 +301,7 @@
           <w:pPr>
             <w:pStyle w:val="TDC1"/>
             <w:tabs>
-              <w:tab w:val="right" w:leader="dot" w:pos="12996"/>
+              <w:tab w:val="right" w:leader="dot" w:pos="8828"/>
             </w:tabs>
             <w:rPr>
               <w:rFonts w:eastAsiaTheme="minorEastAsia"/>
@@ -309,7 +309,7 @@
               <w:lang w:eastAsia="es-MX"/>
             </w:rPr>
           </w:pPr>
-          <w:hyperlink w:anchor="_Toc241765569" w:history="1">
+          <w:hyperlink w:anchor="_Toc242456216" w:history="1">
             <w:r>
               <w:rPr>
                 <w:rStyle w:val="Hipervnculo"/>
@@ -338,7 +338,7 @@
                 <w:noProof/>
                 <w:webHidden/>
               </w:rPr>
-              <w:instrText xml:space="preserve"> PAGEREF _Toc241765569 \h </w:instrText>
+              <w:instrText xml:space="preserve"> PAGEREF _Toc242456216 \h </w:instrText>
             </w:r>
             <w:r>
               <w:rPr>
@@ -358,7 +358,7 @@
                 <w:noProof/>
                 <w:webHidden/>
               </w:rPr>
-              <w:t>6</w:t>
+              <w:t>5</w:t>
             </w:r>
             <w:r>
               <w:rPr>
@@ -373,7 +373,7 @@
           <w:pPr>
             <w:pStyle w:val="TDC1"/>
             <w:tabs>
-              <w:tab w:val="right" w:leader="dot" w:pos="12996"/>
+              <w:tab w:val="right" w:leader="dot" w:pos="8828"/>
             </w:tabs>
             <w:rPr>
               <w:rFonts w:eastAsiaTheme="minorEastAsia"/>
@@ -381,7 +381,7 @@
               <w:lang w:eastAsia="es-MX"/>
             </w:rPr>
           </w:pPr>
-          <w:hyperlink w:anchor="_Toc241765570" w:history="1">
+          <w:hyperlink w:anchor="_Toc242456217" w:history="1">
             <w:r>
               <w:rPr>
                 <w:rStyle w:val="Hipervnculo"/>
@@ -410,7 +410,7 @@
                 <w:noProof/>
                 <w:webHidden/>
               </w:rPr>
-              <w:instrText xml:space="preserve"> PAGEREF _Toc241765570 \h </w:instrText>
+              <w:instrText xml:space="preserve"> PAGEREF _Toc242456217 \h </w:instrText>
             </w:r>
             <w:r>
               <w:rPr>
@@ -430,7 +430,7 @@
                 <w:noProof/>
                 <w:webHidden/>
               </w:rPr>
-              <w:t>7</w:t>
+              <w:t>6</w:t>
             </w:r>
             <w:r>
               <w:rPr>
@@ -445,7 +445,7 @@
           <w:pPr>
             <w:pStyle w:val="TDC1"/>
             <w:tabs>
-              <w:tab w:val="right" w:leader="dot" w:pos="12996"/>
+              <w:tab w:val="right" w:leader="dot" w:pos="8828"/>
             </w:tabs>
             <w:rPr>
               <w:rFonts w:eastAsiaTheme="minorEastAsia"/>
@@ -453,7 +453,7 @@
               <w:lang w:eastAsia="es-MX"/>
             </w:rPr>
           </w:pPr>
-          <w:hyperlink w:anchor="_Toc241765571" w:history="1">
+          <w:hyperlink w:anchor="_Toc242456218" w:history="1">
             <w:r>
               <w:rPr>
                 <w:rStyle w:val="Hipervnculo"/>
@@ -482,7 +482,7 @@
                 <w:noProof/>
                 <w:webHidden/>
               </w:rPr>
-              <w:instrText xml:space="preserve"> PAGEREF _Toc241765571 \h </w:instrText>
+              <w:instrText xml:space="preserve"> PAGEREF _Toc242456218 \h </w:instrText>
             </w:r>
             <w:r>
               <w:rPr>
@@ -502,7 +502,7 @@
                 <w:noProof/>
                 <w:webHidden/>
               </w:rPr>
-              <w:t>7</w:t>
+              <w:t>6</w:t>
             </w:r>
             <w:r>
               <w:rPr>
@@ -517,7 +517,7 @@
           <w:pPr>
             <w:pStyle w:val="TDC1"/>
             <w:tabs>
-              <w:tab w:val="right" w:leader="dot" w:pos="12996"/>
+              <w:tab w:val="right" w:leader="dot" w:pos="8828"/>
             </w:tabs>
             <w:rPr>
               <w:rFonts w:eastAsiaTheme="minorEastAsia"/>
@@ -525,7 +525,7 @@
               <w:lang w:eastAsia="es-MX"/>
             </w:rPr>
           </w:pPr>
-          <w:hyperlink w:anchor="_Toc241765572" w:history="1">
+          <w:hyperlink w:anchor="_Toc242456219" w:history="1">
             <w:r>
               <w:rPr>
                 <w:rStyle w:val="Hipervnculo"/>
@@ -553,7 +553,7 @@
                 <w:noProof/>
                 <w:webHidden/>
               </w:rPr>
-              <w:instrText xml:space="preserve"> PAGEREF _Toc241765572 \h </w:instrText>
+              <w:instrText xml:space="preserve"> PAGEREF _Toc242456219 \h </w:instrText>
             </w:r>
             <w:r>
               <w:rPr>
@@ -573,7 +573,7 @@
                 <w:noProof/>
                 <w:webHidden/>
               </w:rPr>
-              <w:t>8</w:t>
+              <w:t>7</w:t>
             </w:r>
             <w:r>
               <w:rPr>
@@ -588,7 +588,7 @@
           <w:pPr>
             <w:pStyle w:val="TDC1"/>
             <w:tabs>
-              <w:tab w:val="right" w:leader="dot" w:pos="12996"/>
+              <w:tab w:val="right" w:leader="dot" w:pos="8828"/>
             </w:tabs>
             <w:rPr>
               <w:rFonts w:eastAsiaTheme="minorEastAsia"/>
@@ -596,7 +596,7 @@
               <w:lang w:eastAsia="es-MX"/>
             </w:rPr>
           </w:pPr>
-          <w:hyperlink w:anchor="_Toc241765573" w:history="1">
+          <w:hyperlink w:anchor="_Toc242456220" w:history="1">
             <w:r>
               <w:rPr>
                 <w:rStyle w:val="Hipervnculo"/>
@@ -624,7 +624,7 @@
                 <w:noProof/>
                 <w:webHidden/>
               </w:rPr>
-              <w:instrText xml:space="preserve"> PAGEREF _Toc241765573 \h </w:instrText>
+              <w:instrText xml:space="preserve"> PAGEREF _Toc242456220 \h </w:instrText>
             </w:r>
             <w:r>
               <w:rPr>
@@ -644,7 +644,7 @@
                 <w:noProof/>
                 <w:webHidden/>
               </w:rPr>
-              <w:t>9</w:t>
+              <w:t>7</w:t>
             </w:r>
             <w:r>
               <w:rPr>
@@ -659,7 +659,7 @@
           <w:pPr>
             <w:pStyle w:val="TDC1"/>
             <w:tabs>
-              <w:tab w:val="right" w:leader="dot" w:pos="12996"/>
+              <w:tab w:val="right" w:leader="dot" w:pos="8828"/>
             </w:tabs>
             <w:rPr>
               <w:rFonts w:eastAsiaTheme="minorEastAsia"/>
@@ -667,7 +667,7 @@
               <w:lang w:eastAsia="es-MX"/>
             </w:rPr>
           </w:pPr>
-          <w:hyperlink w:anchor="_Toc241765574" w:history="1">
+          <w:hyperlink w:anchor="_Toc242456221" w:history="1">
             <w:r>
               <w:rPr>
                 <w:rStyle w:val="Hipervnculo"/>
@@ -695,7 +695,7 @@
                 <w:noProof/>
                 <w:webHidden/>
               </w:rPr>
-              <w:instrText xml:space="preserve"> PAGEREF _Toc241765574 \h </w:instrText>
+              <w:instrText xml:space="preserve"> PAGEREF _Toc242456221 \h </w:instrText>
             </w:r>
             <w:r>
               <w:rPr>
@@ -715,7 +715,7 @@
                 <w:noProof/>
                 <w:webHidden/>
               </w:rPr>
-              <w:t>9</w:t>
+              <w:t>8</w:t>
             </w:r>
             <w:r>
               <w:rPr>
@@ -730,7 +730,7 @@
           <w:pPr>
             <w:pStyle w:val="TDC1"/>
             <w:tabs>
-              <w:tab w:val="right" w:leader="dot" w:pos="12996"/>
+              <w:tab w:val="right" w:leader="dot" w:pos="8828"/>
             </w:tabs>
             <w:rPr>
               <w:rFonts w:eastAsiaTheme="minorEastAsia"/>
@@ -738,7 +738,7 @@
               <w:lang w:eastAsia="es-MX"/>
             </w:rPr>
           </w:pPr>
-          <w:hyperlink w:anchor="_Toc241765575" w:history="1">
+          <w:hyperlink w:anchor="_Toc242456222" w:history="1">
             <w:r>
               <w:rPr>
                 <w:rStyle w:val="Hipervnculo"/>
@@ -766,7 +766,7 @@
                 <w:noProof/>
                 <w:webHidden/>
               </w:rPr>
-              <w:instrText xml:space="preserve"> PAGEREF _Toc241765575 \h </w:instrText>
+              <w:instrText xml:space="preserve"> PAGEREF _Toc242456222 \h </w:instrText>
             </w:r>
             <w:r>
               <w:rPr>
@@ -786,7 +786,7 @@
                 <w:noProof/>
                 <w:webHidden/>
               </w:rPr>
-              <w:t>10</w:t>
+              <w:t>8</w:t>
             </w:r>
             <w:r>
               <w:rPr>
@@ -801,7 +801,7 @@
           <w:pPr>
             <w:pStyle w:val="TDC1"/>
             <w:tabs>
-              <w:tab w:val="right" w:leader="dot" w:pos="12996"/>
+              <w:tab w:val="right" w:leader="dot" w:pos="8828"/>
             </w:tabs>
             <w:rPr>
               <w:rFonts w:eastAsiaTheme="minorEastAsia"/>
@@ -809,7 +809,7 @@
               <w:lang w:eastAsia="es-MX"/>
             </w:rPr>
           </w:pPr>
-          <w:hyperlink w:anchor="_Toc241765576" w:history="1">
+          <w:hyperlink w:anchor="_Toc242456223" w:history="1">
             <w:r>
               <w:rPr>
                 <w:rStyle w:val="Hipervnculo"/>
@@ -837,7 +837,7 @@
                 <w:noProof/>
                 <w:webHidden/>
               </w:rPr>
-              <w:instrText xml:space="preserve"> PAGEREF _Toc241765576 \h </w:instrText>
+              <w:instrText xml:space="preserve"> PAGEREF _Toc242456223 \h </w:instrText>
             </w:r>
             <w:r>
               <w:rPr>
@@ -857,7 +857,7 @@
                 <w:noProof/>
                 <w:webHidden/>
               </w:rPr>
-              <w:t>10</w:t>
+              <w:t>9</w:t>
             </w:r>
             <w:r>
               <w:rPr>
@@ -872,7 +872,7 @@
           <w:pPr>
             <w:pStyle w:val="TDC1"/>
             <w:tabs>
-              <w:tab w:val="right" w:leader="dot" w:pos="12996"/>
+              <w:tab w:val="right" w:leader="dot" w:pos="8828"/>
             </w:tabs>
             <w:rPr>
               <w:rFonts w:eastAsiaTheme="minorEastAsia"/>
@@ -880,7 +880,7 @@
               <w:lang w:eastAsia="es-MX"/>
             </w:rPr>
           </w:pPr>
-          <w:hyperlink w:anchor="_Toc241765577" w:history="1">
+          <w:hyperlink w:anchor="_Toc242456224" w:history="1">
             <w:r>
               <w:rPr>
                 <w:rStyle w:val="Hipervnculo"/>
@@ -908,7 +908,7 @@
                 <w:noProof/>
                 <w:webHidden/>
               </w:rPr>
-              <w:instrText xml:space="preserve"> PAGEREF _Toc241765577 \h </w:instrText>
+              <w:instrText xml:space="preserve"> PAGEREF _Toc242456224 \h </w:instrText>
             </w:r>
             <w:r>
               <w:rPr>
@@ -928,7 +928,7 @@
                 <w:noProof/>
                 <w:webHidden/>
               </w:rPr>
-              <w:t>11</w:t>
+              <w:t>9</w:t>
             </w:r>
             <w:r>
               <w:rPr>
@@ -943,7 +943,7 @@
           <w:pPr>
             <w:pStyle w:val="TDC1"/>
             <w:tabs>
-              <w:tab w:val="right" w:leader="dot" w:pos="12996"/>
+              <w:tab w:val="right" w:leader="dot" w:pos="8828"/>
             </w:tabs>
             <w:rPr>
               <w:rFonts w:eastAsiaTheme="minorEastAsia"/>
@@ -951,7 +951,7 @@
               <w:lang w:eastAsia="es-MX"/>
             </w:rPr>
           </w:pPr>
-          <w:hyperlink w:anchor="_Toc241765578" w:history="1">
+          <w:hyperlink w:anchor="_Toc242456225" w:history="1">
             <w:r>
               <w:rPr>
                 <w:rStyle w:val="Hipervnculo"/>
@@ -979,7 +979,7 @@
                 <w:noProof/>
                 <w:webHidden/>
               </w:rPr>
-              <w:instrText xml:space="preserve"> PAGEREF _Toc241765578 \h </w:instrText>
+              <w:instrText xml:space="preserve"> PAGEREF _Toc242456225 \h </w:instrText>
             </w:r>
             <w:r>
               <w:rPr>
@@ -999,7 +999,7 @@
                 <w:noProof/>
                 <w:webHidden/>
               </w:rPr>
-              <w:t>11</w:t>
+              <w:t>9</w:t>
             </w:r>
             <w:r>
               <w:rPr>
@@ -1014,7 +1014,7 @@
           <w:pPr>
             <w:pStyle w:val="TDC1"/>
             <w:tabs>
-              <w:tab w:val="right" w:leader="dot" w:pos="12996"/>
+              <w:tab w:val="right" w:leader="dot" w:pos="8828"/>
             </w:tabs>
             <w:rPr>
               <w:rFonts w:eastAsiaTheme="minorEastAsia"/>
@@ -1022,7 +1022,7 @@
               <w:lang w:eastAsia="es-MX"/>
             </w:rPr>
           </w:pPr>
-          <w:hyperlink w:anchor="_Toc241765579" w:history="1">
+          <w:hyperlink w:anchor="_Toc242456226" w:history="1">
             <w:r>
               <w:rPr>
                 <w:rStyle w:val="Hipervnculo"/>
@@ -1050,7 +1050,7 @@
                 <w:noProof/>
                 <w:webHidden/>
               </w:rPr>
-              <w:instrText xml:space="preserve"> PAGEREF _Toc241765579 \h </w:instrText>
+              <w:instrText xml:space="preserve"> PAGEREF _Toc242456226 \h </w:instrText>
             </w:r>
             <w:r>
               <w:rPr>
@@ -1070,7 +1070,7 @@
                 <w:noProof/>
                 <w:webHidden/>
               </w:rPr>
-              <w:t>12</w:t>
+              <w:t>11</w:t>
             </w:r>
             <w:r>
               <w:rPr>
@@ -1085,7 +1085,7 @@
           <w:pPr>
             <w:pStyle w:val="TDC1"/>
             <w:tabs>
-              <w:tab w:val="right" w:leader="dot" w:pos="12996"/>
+              <w:tab w:val="right" w:leader="dot" w:pos="8828"/>
             </w:tabs>
             <w:rPr>
               <w:rFonts w:eastAsiaTheme="minorEastAsia"/>
@@ -1093,7 +1093,7 @@
               <w:lang w:eastAsia="es-MX"/>
             </w:rPr>
           </w:pPr>
-          <w:hyperlink w:anchor="_Toc241765580" w:history="1">
+          <w:hyperlink w:anchor="_Toc242456227" w:history="1">
             <w:r>
               <w:rPr>
                 <w:rStyle w:val="Hipervnculo"/>
@@ -1121,7 +1121,7 @@
                 <w:noProof/>
                 <w:webHidden/>
               </w:rPr>
-              <w:instrText xml:space="preserve"> PAGEREF _Toc241765580 \h </w:instrText>
+              <w:instrText xml:space="preserve"> PAGEREF _Toc242456227 \h </w:instrText>
             </w:r>
             <w:r>
               <w:rPr>
@@ -1141,7 +1141,7 @@
                 <w:noProof/>
                 <w:webHidden/>
               </w:rPr>
-              <w:t>13</w:t>
+              <w:t>11</w:t>
             </w:r>
             <w:r>
               <w:rPr>
@@ -1156,7 +1156,7 @@
           <w:pPr>
             <w:pStyle w:val="TDC1"/>
             <w:tabs>
-              <w:tab w:val="right" w:leader="dot" w:pos="12996"/>
+              <w:tab w:val="right" w:leader="dot" w:pos="8828"/>
             </w:tabs>
             <w:rPr>
               <w:rFonts w:eastAsiaTheme="minorEastAsia"/>
@@ -1164,7 +1164,7 @@
               <w:lang w:eastAsia="es-MX"/>
             </w:rPr>
           </w:pPr>
-          <w:hyperlink w:anchor="_Toc241765581" w:history="1">
+          <w:hyperlink w:anchor="_Toc242456228" w:history="1">
             <w:r>
               <w:rPr>
                 <w:rStyle w:val="Hipervnculo"/>
@@ -1193,7 +1193,7 @@
                 <w:noProof/>
                 <w:webHidden/>
               </w:rPr>
-              <w:instrText xml:space="preserve"> PAGEREF _Toc241765581 \h </w:instrText>
+              <w:instrText xml:space="preserve"> PAGEREF _Toc242456228 \h </w:instrText>
             </w:r>
             <w:r>
               <w:rPr>
@@ -1213,7 +1213,7 @@
                 <w:noProof/>
                 <w:webHidden/>
               </w:rPr>
-              <w:t>13</w:t>
+              <w:t>11</w:t>
             </w:r>
             <w:r>
               <w:rPr>
@@ -1228,7 +1228,7 @@
           <w:pPr>
             <w:pStyle w:val="TDC1"/>
             <w:tabs>
-              <w:tab w:val="right" w:leader="dot" w:pos="12996"/>
+              <w:tab w:val="right" w:leader="dot" w:pos="8828"/>
             </w:tabs>
             <w:rPr>
               <w:rFonts w:eastAsiaTheme="minorEastAsia"/>
@@ -1236,7 +1236,7 @@
               <w:lang w:eastAsia="es-MX"/>
             </w:rPr>
           </w:pPr>
-          <w:hyperlink w:anchor="_Toc241765582" w:history="1">
+          <w:hyperlink w:anchor="_Toc242456229" w:history="1">
             <w:r>
               <w:rPr>
                 <w:rStyle w:val="Hipervnculo"/>
@@ -1265,7 +1265,7 @@
                 <w:noProof/>
                 <w:webHidden/>
               </w:rPr>
-              <w:instrText xml:space="preserve"> PAGEREF _Toc241765582 \h </w:instrText>
+              <w:instrText xml:space="preserve"> PAGEREF _Toc242456229 \h </w:instrText>
             </w:r>
             <w:r>
               <w:rPr>
@@ -1285,7 +1285,7 @@
                 <w:noProof/>
                 <w:webHidden/>
               </w:rPr>
-              <w:t>14</w:t>
+              <w:t>12</w:t>
             </w:r>
             <w:r>
               <w:rPr>
@@ -1300,7 +1300,7 @@
           <w:pPr>
             <w:pStyle w:val="TDC1"/>
             <w:tabs>
-              <w:tab w:val="right" w:leader="dot" w:pos="12996"/>
+              <w:tab w:val="right" w:leader="dot" w:pos="8828"/>
             </w:tabs>
             <w:rPr>
               <w:rFonts w:eastAsiaTheme="minorEastAsia"/>
@@ -1308,7 +1308,7 @@
               <w:lang w:eastAsia="es-MX"/>
             </w:rPr>
           </w:pPr>
-          <w:hyperlink w:anchor="_Toc241765583" w:history="1">
+          <w:hyperlink w:anchor="_Toc242456230" w:history="1">
             <w:r>
               <w:rPr>
                 <w:rStyle w:val="Hipervnculo"/>
@@ -1337,7 +1337,7 @@
                 <w:noProof/>
                 <w:webHidden/>
               </w:rPr>
-              <w:instrText xml:space="preserve"> PAGEREF _Toc241765583 \h </w:instrText>
+              <w:instrText xml:space="preserve"> PAGEREF _Toc242456230 \h </w:instrText>
             </w:r>
             <w:r>
               <w:rPr>
@@ -1357,7 +1357,7 @@
                 <w:noProof/>
                 <w:webHidden/>
               </w:rPr>
-              <w:t>14</w:t>
+              <w:t>12</w:t>
             </w:r>
             <w:r>
               <w:rPr>
@@ -1372,7 +1372,7 @@
           <w:pPr>
             <w:pStyle w:val="TDC1"/>
             <w:tabs>
-              <w:tab w:val="right" w:leader="dot" w:pos="12996"/>
+              <w:tab w:val="right" w:leader="dot" w:pos="8828"/>
             </w:tabs>
             <w:rPr>
               <w:rFonts w:eastAsiaTheme="minorEastAsia"/>
@@ -1380,7 +1380,7 @@
               <w:lang w:eastAsia="es-MX"/>
             </w:rPr>
           </w:pPr>
-          <w:hyperlink w:anchor="_Toc241765584" w:history="1">
+          <w:hyperlink w:anchor="_Toc242456231" w:history="1">
             <w:r>
               <w:rPr>
                 <w:rStyle w:val="Hipervnculo"/>
@@ -1408,7 +1408,7 @@
                 <w:noProof/>
                 <w:webHidden/>
               </w:rPr>
-              <w:instrText xml:space="preserve"> PAGEREF _Toc241765584 \h </w:instrText>
+              <w:instrText xml:space="preserve"> PAGEREF _Toc242456231 \h </w:instrText>
             </w:r>
             <w:r>
               <w:rPr>
@@ -1428,7 +1428,7 @@
                 <w:noProof/>
                 <w:webHidden/>
               </w:rPr>
-              <w:t>14</w:t>
+              <w:t>12</w:t>
             </w:r>
             <w:r>
               <w:rPr>
@@ -1443,7 +1443,7 @@
           <w:pPr>
             <w:pStyle w:val="TDC1"/>
             <w:tabs>
-              <w:tab w:val="right" w:leader="dot" w:pos="12996"/>
+              <w:tab w:val="right" w:leader="dot" w:pos="8828"/>
             </w:tabs>
             <w:rPr>
               <w:rFonts w:eastAsiaTheme="minorEastAsia"/>
@@ -1451,7 +1451,7 @@
               <w:lang w:eastAsia="es-MX"/>
             </w:rPr>
           </w:pPr>
-          <w:hyperlink w:anchor="_Toc241765585" w:history="1">
+          <w:hyperlink w:anchor="_Toc242456232" w:history="1">
             <w:r>
               <w:rPr>
                 <w:rStyle w:val="Hipervnculo"/>
@@ -1479,7 +1479,7 @@
                 <w:noProof/>
                 <w:webHidden/>
               </w:rPr>
-              <w:instrText xml:space="preserve"> PAGEREF _Toc241765585 \h </w:instrText>
+              <w:instrText xml:space="preserve"> PAGEREF _Toc242456232 \h </w:instrText>
             </w:r>
             <w:r>
               <w:rPr>
@@ -1499,7 +1499,7 @@
                 <w:noProof/>
                 <w:webHidden/>
               </w:rPr>
-              <w:t>17</w:t>
+              <w:t>16</w:t>
             </w:r>
             <w:r>
               <w:rPr>
@@ -1514,7 +1514,7 @@
           <w:pPr>
             <w:pStyle w:val="TDC1"/>
             <w:tabs>
-              <w:tab w:val="right" w:leader="dot" w:pos="12996"/>
+              <w:tab w:val="right" w:leader="dot" w:pos="8828"/>
             </w:tabs>
             <w:rPr>
               <w:rFonts w:eastAsiaTheme="minorEastAsia"/>
@@ -1522,7 +1522,7 @@
               <w:lang w:eastAsia="es-MX"/>
             </w:rPr>
           </w:pPr>
-          <w:hyperlink w:anchor="_Toc241765586" w:history="1">
+          <w:hyperlink w:anchor="_Toc242456233" w:history="1">
             <w:r>
               <w:rPr>
                 <w:rStyle w:val="Hipervnculo"/>
@@ -1550,7 +1550,7 @@
                 <w:noProof/>
                 <w:webHidden/>
               </w:rPr>
-              <w:instrText xml:space="preserve"> PAGEREF _Toc241765586 \h </w:instrText>
+              <w:instrText xml:space="preserve"> PAGEREF _Toc242456233 \h </w:instrText>
             </w:r>
             <w:r>
               <w:rPr>
@@ -1570,7 +1570,7 @@
                 <w:noProof/>
                 <w:webHidden/>
               </w:rPr>
-              <w:t>20</w:t>
+              <w:t>18</w:t>
             </w:r>
             <w:r>
               <w:rPr>
@@ -1585,7 +1585,7 @@
           <w:pPr>
             <w:pStyle w:val="TDC1"/>
             <w:tabs>
-              <w:tab w:val="right" w:leader="dot" w:pos="12996"/>
+              <w:tab w:val="right" w:leader="dot" w:pos="8828"/>
             </w:tabs>
             <w:rPr>
               <w:rFonts w:eastAsiaTheme="minorEastAsia"/>
@@ -1593,14 +1593,14 @@
               <w:lang w:eastAsia="es-MX"/>
             </w:rPr>
           </w:pPr>
-          <w:hyperlink w:anchor="_Toc241765587" w:history="1">
+          <w:hyperlink w:anchor="_Toc242456234" w:history="1">
             <w:r>
               <w:rPr>
                 <w:rStyle w:val="Hipervnculo"/>
                 <w:rFonts w:cstheme="minorHAnsi"/>
                 <w:noProof/>
               </w:rPr>
-              <w:t>Diagramas Caso De Uso</w:t>
+              <w:t>Diagramas Caso De Uso y documentacion</w:t>
             </w:r>
             <w:r>
               <w:rPr>
@@ -1621,7 +1621,7 @@
                 <w:noProof/>
                 <w:webHidden/>
               </w:rPr>
-              <w:instrText xml:space="preserve"> PAGEREF _Toc241765587 \h </w:instrText>
+              <w:instrText xml:space="preserve"> PAGEREF _Toc242456234 \h </w:instrText>
             </w:r>
             <w:r>
               <w:rPr>
@@ -1641,7 +1641,7 @@
                 <w:noProof/>
                 <w:webHidden/>
               </w:rPr>
-              <w:t>21</w:t>
+              <w:t>19</w:t>
             </w:r>
             <w:r>
               <w:rPr>
@@ -1656,7 +1656,7 @@
           <w:pPr>
             <w:pStyle w:val="TDC1"/>
             <w:tabs>
-              <w:tab w:val="right" w:leader="dot" w:pos="12996"/>
+              <w:tab w:val="right" w:leader="dot" w:pos="8828"/>
             </w:tabs>
             <w:rPr>
               <w:rFonts w:eastAsiaTheme="minorEastAsia"/>
@@ -1664,7 +1664,7 @@
               <w:lang w:eastAsia="es-MX"/>
             </w:rPr>
           </w:pPr>
-          <w:hyperlink w:anchor="_Toc241765588" w:history="1">
+          <w:hyperlink w:anchor="_Toc242456235" w:history="1">
             <w:r>
               <w:rPr>
                 <w:rStyle w:val="Hipervnculo"/>
@@ -1692,7 +1692,7 @@
                 <w:noProof/>
                 <w:webHidden/>
               </w:rPr>
-              <w:instrText xml:space="preserve"> PAGEREF _Toc241765588 \h </w:instrText>
+              <w:instrText xml:space="preserve"> PAGEREF _Toc242456235 \h </w:instrText>
             </w:r>
             <w:r>
               <w:rPr>
@@ -1712,7 +1712,7 @@
                 <w:noProof/>
                 <w:webHidden/>
               </w:rPr>
-              <w:t>21</w:t>
+              <w:t>30</w:t>
             </w:r>
             <w:r>
               <w:rPr>
@@ -1727,7 +1727,7 @@
           <w:pPr>
             <w:pStyle w:val="TDC1"/>
             <w:tabs>
-              <w:tab w:val="right" w:leader="dot" w:pos="12996"/>
+              <w:tab w:val="right" w:leader="dot" w:pos="8828"/>
             </w:tabs>
             <w:rPr>
               <w:rFonts w:eastAsiaTheme="minorEastAsia"/>
@@ -1735,7 +1735,7 @@
               <w:lang w:eastAsia="es-MX"/>
             </w:rPr>
           </w:pPr>
-          <w:hyperlink w:anchor="_Toc241765589" w:history="1">
+          <w:hyperlink w:anchor="_Toc242456236" w:history="1">
             <w:r>
               <w:rPr>
                 <w:rStyle w:val="Hipervnculo"/>
@@ -1763,7 +1763,7 @@
                 <w:noProof/>
                 <w:webHidden/>
               </w:rPr>
-              <w:instrText xml:space="preserve"> PAGEREF _Toc241765589 \h </w:instrText>
+              <w:instrText xml:space="preserve"> PAGEREF _Toc242456236 \h </w:instrText>
             </w:r>
             <w:r>
               <w:rPr>
@@ -1783,7 +1783,7 @@
                 <w:noProof/>
                 <w:webHidden/>
               </w:rPr>
-              <w:t>22</w:t>
+              <w:t>36</w:t>
             </w:r>
             <w:r>
               <w:rPr>
@@ -1798,7 +1798,7 @@
           <w:pPr>
             <w:pStyle w:val="TDC1"/>
             <w:tabs>
-              <w:tab w:val="right" w:leader="dot" w:pos="12996"/>
+              <w:tab w:val="right" w:leader="dot" w:pos="8828"/>
             </w:tabs>
             <w:rPr>
               <w:rFonts w:eastAsiaTheme="minorEastAsia"/>
@@ -1806,7 +1806,7 @@
               <w:lang w:eastAsia="es-MX"/>
             </w:rPr>
           </w:pPr>
-          <w:hyperlink w:anchor="_Toc241765590" w:history="1">
+          <w:hyperlink w:anchor="_Toc242456237" w:history="1">
             <w:r>
               <w:rPr>
                 <w:rStyle w:val="Hipervnculo"/>
@@ -1834,7 +1834,7 @@
                 <w:noProof/>
                 <w:webHidden/>
               </w:rPr>
-              <w:instrText xml:space="preserve"> PAGEREF _Toc241765590 \h </w:instrText>
+              <w:instrText xml:space="preserve"> PAGEREF _Toc242456237 \h </w:instrText>
             </w:r>
             <w:r>
               <w:rPr>
@@ -1854,7 +1854,7 @@
                 <w:noProof/>
                 <w:webHidden/>
               </w:rPr>
-              <w:t>22</w:t>
+              <w:t>36</w:t>
             </w:r>
             <w:r>
               <w:rPr>
@@ -1869,7 +1869,7 @@
           <w:pPr>
             <w:pStyle w:val="TDC1"/>
             <w:tabs>
-              <w:tab w:val="right" w:leader="dot" w:pos="12996"/>
+              <w:tab w:val="right" w:leader="dot" w:pos="8828"/>
             </w:tabs>
             <w:rPr>
               <w:rFonts w:eastAsiaTheme="minorEastAsia"/>
@@ -1877,7 +1877,7 @@
               <w:lang w:eastAsia="es-MX"/>
             </w:rPr>
           </w:pPr>
-          <w:hyperlink w:anchor="_Toc241765591" w:history="1">
+          <w:hyperlink w:anchor="_Toc242456238" w:history="1">
             <w:r>
               <w:rPr>
                 <w:rStyle w:val="Hipervnculo"/>
@@ -1905,7 +1905,7 @@
                 <w:noProof/>
                 <w:webHidden/>
               </w:rPr>
-              <w:instrText xml:space="preserve"> PAGEREF _Toc241765591 \h </w:instrText>
+              <w:instrText xml:space="preserve"> PAGEREF _Toc242456238 \h </w:instrText>
             </w:r>
             <w:r>
               <w:rPr>
@@ -1925,7 +1925,7 @@
                 <w:noProof/>
                 <w:webHidden/>
               </w:rPr>
-              <w:t>23</w:t>
+              <w:t>36</w:t>
             </w:r>
             <w:r>
               <w:rPr>
@@ -1940,7 +1940,7 @@
           <w:pPr>
             <w:pStyle w:val="TDC2"/>
             <w:tabs>
-              <w:tab w:val="right" w:leader="dot" w:pos="12996"/>
+              <w:tab w:val="right" w:leader="dot" w:pos="8828"/>
             </w:tabs>
             <w:rPr>
               <w:rFonts w:eastAsiaTheme="minorEastAsia"/>
@@ -1948,7 +1948,7 @@
               <w:lang w:eastAsia="es-MX"/>
             </w:rPr>
           </w:pPr>
-          <w:hyperlink w:anchor="_Toc241765592" w:history="1">
+          <w:hyperlink w:anchor="_Toc242456239" w:history="1">
             <w:r>
               <w:rPr>
                 <w:rStyle w:val="Hipervnculo"/>
@@ -1976,7 +1976,7 @@
                 <w:noProof/>
                 <w:webHidden/>
               </w:rPr>
-              <w:instrText xml:space="preserve"> PAGEREF _Toc241765592 \h </w:instrText>
+              <w:instrText xml:space="preserve"> PAGEREF _Toc242456239 \h </w:instrText>
             </w:r>
             <w:r>
               <w:rPr>
@@ -1996,7 +1996,7 @@
                 <w:noProof/>
                 <w:webHidden/>
               </w:rPr>
-              <w:t>23</w:t>
+              <w:t>36</w:t>
             </w:r>
             <w:r>
               <w:rPr>
@@ -2011,7 +2011,7 @@
           <w:pPr>
             <w:pStyle w:val="TDC2"/>
             <w:tabs>
-              <w:tab w:val="right" w:leader="dot" w:pos="12996"/>
+              <w:tab w:val="right" w:leader="dot" w:pos="8828"/>
             </w:tabs>
             <w:rPr>
               <w:rFonts w:eastAsiaTheme="minorEastAsia"/>
@@ -2019,7 +2019,7 @@
               <w:lang w:eastAsia="es-MX"/>
             </w:rPr>
           </w:pPr>
-          <w:hyperlink w:anchor="_Toc241765593" w:history="1">
+          <w:hyperlink w:anchor="_Toc242456240" w:history="1">
             <w:r>
               <w:rPr>
                 <w:rStyle w:val="Hipervnculo"/>
@@ -2047,7 +2047,7 @@
                 <w:noProof/>
                 <w:webHidden/>
               </w:rPr>
-              <w:instrText xml:space="preserve"> PAGEREF _Toc241765593 \h </w:instrText>
+              <w:instrText xml:space="preserve"> PAGEREF _Toc242456240 \h </w:instrText>
             </w:r>
             <w:r>
               <w:rPr>
@@ -2067,7 +2067,7 @@
                 <w:noProof/>
                 <w:webHidden/>
               </w:rPr>
-              <w:t>23</w:t>
+              <w:t>36</w:t>
             </w:r>
             <w:r>
               <w:rPr>
@@ -2082,7 +2082,7 @@
           <w:pPr>
             <w:pStyle w:val="TDC2"/>
             <w:tabs>
-              <w:tab w:val="right" w:leader="dot" w:pos="12996"/>
+              <w:tab w:val="right" w:leader="dot" w:pos="8828"/>
             </w:tabs>
             <w:rPr>
               <w:rFonts w:eastAsiaTheme="minorEastAsia"/>
@@ -2090,7 +2090,7 @@
               <w:lang w:eastAsia="es-MX"/>
             </w:rPr>
           </w:pPr>
-          <w:hyperlink w:anchor="_Toc241765594" w:history="1">
+          <w:hyperlink w:anchor="_Toc242456241" w:history="1">
             <w:r>
               <w:rPr>
                 <w:rStyle w:val="Hipervnculo"/>
@@ -2118,7 +2118,7 @@
                 <w:noProof/>
                 <w:webHidden/>
               </w:rPr>
-              <w:instrText xml:space="preserve"> PAGEREF _Toc241765594 \h </w:instrText>
+              <w:instrText xml:space="preserve"> PAGEREF _Toc242456241 \h </w:instrText>
             </w:r>
             <w:r>
               <w:rPr>
@@ -2138,7 +2138,7 @@
                 <w:noProof/>
                 <w:webHidden/>
               </w:rPr>
-              <w:t>23</w:t>
+              <w:t>36</w:t>
             </w:r>
             <w:r>
               <w:rPr>
@@ -2153,7 +2153,7 @@
           <w:pPr>
             <w:pStyle w:val="TDC2"/>
             <w:tabs>
-              <w:tab w:val="right" w:leader="dot" w:pos="12996"/>
+              <w:tab w:val="right" w:leader="dot" w:pos="8828"/>
             </w:tabs>
             <w:rPr>
               <w:rFonts w:eastAsiaTheme="minorEastAsia"/>
@@ -2161,7 +2161,7 @@
               <w:lang w:eastAsia="es-MX"/>
             </w:rPr>
           </w:pPr>
-          <w:hyperlink w:anchor="_Toc241765595" w:history="1">
+          <w:hyperlink w:anchor="_Toc242456242" w:history="1">
             <w:r>
               <w:rPr>
                 <w:rStyle w:val="Hipervnculo"/>
@@ -2189,7 +2189,7 @@
                 <w:noProof/>
                 <w:webHidden/>
               </w:rPr>
-              <w:instrText xml:space="preserve"> PAGEREF _Toc241765595 \h </w:instrText>
+              <w:instrText xml:space="preserve"> PAGEREF _Toc242456242 \h </w:instrText>
             </w:r>
             <w:r>
               <w:rPr>
@@ -2209,7 +2209,7 @@
                 <w:noProof/>
                 <w:webHidden/>
               </w:rPr>
-              <w:t>23</w:t>
+              <w:t>37</w:t>
             </w:r>
             <w:r>
               <w:rPr>
@@ -2224,7 +2224,7 @@
           <w:pPr>
             <w:pStyle w:val="TDC2"/>
             <w:tabs>
-              <w:tab w:val="right" w:leader="dot" w:pos="12996"/>
+              <w:tab w:val="right" w:leader="dot" w:pos="8828"/>
             </w:tabs>
             <w:rPr>
               <w:rFonts w:eastAsiaTheme="minorEastAsia"/>
@@ -2232,7 +2232,7 @@
               <w:lang w:eastAsia="es-MX"/>
             </w:rPr>
           </w:pPr>
-          <w:hyperlink w:anchor="_Toc241765596" w:history="1">
+          <w:hyperlink w:anchor="_Toc242456243" w:history="1">
             <w:r>
               <w:rPr>
                 <w:rStyle w:val="Hipervnculo"/>
@@ -2260,7 +2260,7 @@
                 <w:noProof/>
                 <w:webHidden/>
               </w:rPr>
-              <w:instrText xml:space="preserve"> PAGEREF _Toc241765596 \h </w:instrText>
+              <w:instrText xml:space="preserve"> PAGEREF _Toc242456243 \h </w:instrText>
             </w:r>
             <w:r>
               <w:rPr>
@@ -2280,7 +2280,7 @@
                 <w:noProof/>
                 <w:webHidden/>
               </w:rPr>
-              <w:t>23</w:t>
+              <w:t>37</w:t>
             </w:r>
             <w:r>
               <w:rPr>
@@ -2295,7 +2295,7 @@
           <w:pPr>
             <w:pStyle w:val="TDC2"/>
             <w:tabs>
-              <w:tab w:val="right" w:leader="dot" w:pos="12996"/>
+              <w:tab w:val="right" w:leader="dot" w:pos="8828"/>
             </w:tabs>
             <w:rPr>
               <w:rFonts w:eastAsiaTheme="minorEastAsia"/>
@@ -2303,7 +2303,7 @@
               <w:lang w:eastAsia="es-MX"/>
             </w:rPr>
           </w:pPr>
-          <w:hyperlink w:anchor="_Toc241765597" w:history="1">
+          <w:hyperlink w:anchor="_Toc242456244" w:history="1">
             <w:r>
               <w:rPr>
                 <w:rStyle w:val="Hipervnculo"/>
@@ -2331,7 +2331,7 @@
                 <w:noProof/>
                 <w:webHidden/>
               </w:rPr>
-              <w:instrText xml:space="preserve"> PAGEREF _Toc241765597 \h </w:instrText>
+              <w:instrText xml:space="preserve"> PAGEREF _Toc242456244 \h </w:instrText>
             </w:r>
             <w:r>
               <w:rPr>
@@ -2351,7 +2351,7 @@
                 <w:noProof/>
                 <w:webHidden/>
               </w:rPr>
-              <w:t>23</w:t>
+              <w:t>37</w:t>
             </w:r>
             <w:r>
               <w:rPr>
@@ -2366,7 +2366,7 @@
           <w:pPr>
             <w:pStyle w:val="TDC2"/>
             <w:tabs>
-              <w:tab w:val="right" w:leader="dot" w:pos="12996"/>
+              <w:tab w:val="right" w:leader="dot" w:pos="8828"/>
             </w:tabs>
             <w:rPr>
               <w:rFonts w:eastAsiaTheme="minorEastAsia"/>
@@ -2374,7 +2374,7 @@
               <w:lang w:eastAsia="es-MX"/>
             </w:rPr>
           </w:pPr>
-          <w:hyperlink w:anchor="_Toc241765598" w:history="1">
+          <w:hyperlink w:anchor="_Toc242456245" w:history="1">
             <w:r>
               <w:rPr>
                 <w:rStyle w:val="Hipervnculo"/>
@@ -2402,7 +2402,7 @@
                 <w:noProof/>
                 <w:webHidden/>
               </w:rPr>
-              <w:instrText xml:space="preserve"> PAGEREF _Toc241765598 \h </w:instrText>
+              <w:instrText xml:space="preserve"> PAGEREF _Toc242456245 \h </w:instrText>
             </w:r>
             <w:r>
               <w:rPr>
@@ -2422,7 +2422,7 @@
                 <w:noProof/>
                 <w:webHidden/>
               </w:rPr>
-              <w:t>24</w:t>
+              <w:t>37</w:t>
             </w:r>
             <w:r>
               <w:rPr>
@@ -2437,7 +2437,7 @@
           <w:pPr>
             <w:pStyle w:val="TDC2"/>
             <w:tabs>
-              <w:tab w:val="right" w:leader="dot" w:pos="12996"/>
+              <w:tab w:val="right" w:leader="dot" w:pos="8828"/>
             </w:tabs>
             <w:rPr>
               <w:rFonts w:eastAsiaTheme="minorEastAsia"/>
@@ -2445,7 +2445,7 @@
               <w:lang w:eastAsia="es-MX"/>
             </w:rPr>
           </w:pPr>
-          <w:hyperlink w:anchor="_Toc241765599" w:history="1">
+          <w:hyperlink w:anchor="_Toc242456246" w:history="1">
             <w:r>
               <w:rPr>
                 <w:rStyle w:val="Hipervnculo"/>
@@ -2473,7 +2473,7 @@
                 <w:noProof/>
                 <w:webHidden/>
               </w:rPr>
-              <w:instrText xml:space="preserve"> PAGEREF _Toc241765599 \h </w:instrText>
+              <w:instrText xml:space="preserve"> PAGEREF _Toc242456246 \h </w:instrText>
             </w:r>
             <w:r>
               <w:rPr>
@@ -2493,7 +2493,7 @@
                 <w:noProof/>
                 <w:webHidden/>
               </w:rPr>
-              <w:t>24</w:t>
+              <w:t>37</w:t>
             </w:r>
             <w:r>
               <w:rPr>
@@ -2508,7 +2508,7 @@
           <w:pPr>
             <w:pStyle w:val="TDC2"/>
             <w:tabs>
-              <w:tab w:val="right" w:leader="dot" w:pos="12996"/>
+              <w:tab w:val="right" w:leader="dot" w:pos="8828"/>
             </w:tabs>
             <w:rPr>
               <w:rFonts w:eastAsiaTheme="minorEastAsia"/>
@@ -2516,7 +2516,7 @@
               <w:lang w:eastAsia="es-MX"/>
             </w:rPr>
           </w:pPr>
-          <w:hyperlink w:anchor="_Toc241765600" w:history="1">
+          <w:hyperlink w:anchor="_Toc242456247" w:history="1">
             <w:r>
               <w:rPr>
                 <w:rStyle w:val="Hipervnculo"/>
@@ -2544,7 +2544,7 @@
                 <w:noProof/>
                 <w:webHidden/>
               </w:rPr>
-              <w:instrText xml:space="preserve"> PAGEREF _Toc241765600 \h </w:instrText>
+              <w:instrText xml:space="preserve"> PAGEREF _Toc242456247 \h </w:instrText>
             </w:r>
             <w:r>
               <w:rPr>
@@ -2564,7 +2564,7 @@
                 <w:noProof/>
                 <w:webHidden/>
               </w:rPr>
-              <w:t>24</w:t>
+              <w:t>37</w:t>
             </w:r>
             <w:r>
               <w:rPr>
@@ -2579,7 +2579,7 @@
           <w:pPr>
             <w:pStyle w:val="TDC2"/>
             <w:tabs>
-              <w:tab w:val="right" w:leader="dot" w:pos="12996"/>
+              <w:tab w:val="right" w:leader="dot" w:pos="8828"/>
             </w:tabs>
             <w:rPr>
               <w:rFonts w:eastAsiaTheme="minorEastAsia"/>
@@ -2587,7 +2587,7 @@
               <w:lang w:eastAsia="es-MX"/>
             </w:rPr>
           </w:pPr>
-          <w:hyperlink w:anchor="_Toc241765601" w:history="1">
+          <w:hyperlink w:anchor="_Toc242456248" w:history="1">
             <w:r>
               <w:rPr>
                 <w:rStyle w:val="Hipervnculo"/>
@@ -2615,7 +2615,7 @@
                 <w:noProof/>
                 <w:webHidden/>
               </w:rPr>
-              <w:instrText xml:space="preserve"> PAGEREF _Toc241765601 \h </w:instrText>
+              <w:instrText xml:space="preserve"> PAGEREF _Toc242456248 \h </w:instrText>
             </w:r>
             <w:r>
               <w:rPr>
@@ -2635,7 +2635,7 @@
                 <w:noProof/>
                 <w:webHidden/>
               </w:rPr>
-              <w:t>24</w:t>
+              <w:t>37</w:t>
             </w:r>
             <w:r>
               <w:rPr>
@@ -2650,7 +2650,7 @@
           <w:pPr>
             <w:pStyle w:val="TDC2"/>
             <w:tabs>
-              <w:tab w:val="right" w:leader="dot" w:pos="12996"/>
+              <w:tab w:val="right" w:leader="dot" w:pos="8828"/>
             </w:tabs>
             <w:rPr>
               <w:rFonts w:eastAsiaTheme="minorEastAsia"/>
@@ -2658,7 +2658,7 @@
               <w:lang w:eastAsia="es-MX"/>
             </w:rPr>
           </w:pPr>
-          <w:hyperlink w:anchor="_Toc241765602" w:history="1">
+          <w:hyperlink w:anchor="_Toc242456249" w:history="1">
             <w:r>
               <w:rPr>
                 <w:rStyle w:val="Hipervnculo"/>
@@ -2686,7 +2686,7 @@
                 <w:noProof/>
                 <w:webHidden/>
               </w:rPr>
-              <w:instrText xml:space="preserve"> PAGEREF _Toc241765602 \h </w:instrText>
+              <w:instrText xml:space="preserve"> PAGEREF _Toc242456249 \h </w:instrText>
             </w:r>
             <w:r>
               <w:rPr>
@@ -2706,7 +2706,7 @@
                 <w:noProof/>
                 <w:webHidden/>
               </w:rPr>
-              <w:t>24</w:t>
+              <w:t>37</w:t>
             </w:r>
             <w:r>
               <w:rPr>
@@ -2721,7 +2721,7 @@
           <w:pPr>
             <w:pStyle w:val="TDC1"/>
             <w:tabs>
-              <w:tab w:val="right" w:leader="dot" w:pos="12996"/>
+              <w:tab w:val="right" w:leader="dot" w:pos="8828"/>
             </w:tabs>
             <w:rPr>
               <w:rFonts w:eastAsiaTheme="minorEastAsia"/>
@@ -2729,7 +2729,7 @@
               <w:lang w:eastAsia="es-MX"/>
             </w:rPr>
           </w:pPr>
-          <w:hyperlink w:anchor="_Toc241765603" w:history="1">
+          <w:hyperlink w:anchor="_Toc242456250" w:history="1">
             <w:r>
               <w:rPr>
                 <w:rStyle w:val="Hipervnculo"/>
@@ -2756,7 +2756,7 @@
                 <w:noProof/>
                 <w:webHidden/>
               </w:rPr>
-              <w:instrText xml:space="preserve"> PAGEREF _Toc241765603 \h </w:instrText>
+              <w:instrText xml:space="preserve"> PAGEREF _Toc242456250 \h </w:instrText>
             </w:r>
             <w:r>
               <w:rPr>
@@ -2776,7 +2776,7 @@
                 <w:noProof/>
                 <w:webHidden/>
               </w:rPr>
-              <w:t>24</w:t>
+              <w:t>38</w:t>
             </w:r>
             <w:r>
               <w:rPr>
@@ -2791,7 +2791,7 @@
           <w:pPr>
             <w:pStyle w:val="TDC2"/>
             <w:tabs>
-              <w:tab w:val="right" w:leader="dot" w:pos="12996"/>
+              <w:tab w:val="right" w:leader="dot" w:pos="8828"/>
             </w:tabs>
             <w:rPr>
               <w:rFonts w:eastAsiaTheme="minorEastAsia"/>
@@ -2799,7 +2799,7 @@
               <w:lang w:eastAsia="es-MX"/>
             </w:rPr>
           </w:pPr>
-          <w:hyperlink w:anchor="_Toc241765604" w:history="1">
+          <w:hyperlink w:anchor="_Toc242456251" w:history="1">
             <w:r>
               <w:rPr>
                 <w:rStyle w:val="Hipervnculo"/>
@@ -2827,7 +2827,7 @@
                 <w:noProof/>
                 <w:webHidden/>
               </w:rPr>
-              <w:instrText xml:space="preserve"> PAGEREF _Toc241765604 \h </w:instrText>
+              <w:instrText xml:space="preserve"> PAGEREF _Toc242456251 \h </w:instrText>
             </w:r>
             <w:r>
               <w:rPr>
@@ -2847,7 +2847,7 @@
                 <w:noProof/>
                 <w:webHidden/>
               </w:rPr>
-              <w:t>25</w:t>
+              <w:t>38</w:t>
             </w:r>
             <w:r>
               <w:rPr>
@@ -2862,7 +2862,7 @@
           <w:pPr>
             <w:pStyle w:val="TDC2"/>
             <w:tabs>
-              <w:tab w:val="right" w:leader="dot" w:pos="12996"/>
+              <w:tab w:val="right" w:leader="dot" w:pos="8828"/>
             </w:tabs>
             <w:rPr>
               <w:rFonts w:eastAsiaTheme="minorEastAsia"/>
@@ -2870,7 +2870,7 @@
               <w:lang w:eastAsia="es-MX"/>
             </w:rPr>
           </w:pPr>
-          <w:hyperlink w:anchor="_Toc241765605" w:history="1">
+          <w:hyperlink w:anchor="_Toc242456252" w:history="1">
             <w:r>
               <w:rPr>
                 <w:rStyle w:val="Hipervnculo"/>
@@ -2898,7 +2898,7 @@
                 <w:noProof/>
                 <w:webHidden/>
               </w:rPr>
-              <w:instrText xml:space="preserve"> PAGEREF _Toc241765605 \h </w:instrText>
+              <w:instrText xml:space="preserve"> PAGEREF _Toc242456252 \h </w:instrText>
             </w:r>
             <w:r>
               <w:rPr>
@@ -2918,7 +2918,7 @@
                 <w:noProof/>
                 <w:webHidden/>
               </w:rPr>
-              <w:t>25</w:t>
+              <w:t>38</w:t>
             </w:r>
             <w:r>
               <w:rPr>
@@ -2933,7 +2933,7 @@
           <w:pPr>
             <w:pStyle w:val="TDC2"/>
             <w:tabs>
-              <w:tab w:val="right" w:leader="dot" w:pos="12996"/>
+              <w:tab w:val="right" w:leader="dot" w:pos="8828"/>
             </w:tabs>
             <w:rPr>
               <w:rFonts w:eastAsiaTheme="minorEastAsia"/>
@@ -2941,7 +2941,7 @@
               <w:lang w:eastAsia="es-MX"/>
             </w:rPr>
           </w:pPr>
-          <w:hyperlink w:anchor="_Toc241765606" w:history="1">
+          <w:hyperlink w:anchor="_Toc242456253" w:history="1">
             <w:r>
               <w:rPr>
                 <w:rStyle w:val="Hipervnculo"/>
@@ -2969,7 +2969,7 @@
                 <w:noProof/>
                 <w:webHidden/>
               </w:rPr>
-              <w:instrText xml:space="preserve"> PAGEREF _Toc241765606 \h </w:instrText>
+              <w:instrText xml:space="preserve"> PAGEREF _Toc242456253 \h </w:instrText>
             </w:r>
             <w:r>
               <w:rPr>
@@ -2989,7 +2989,7 @@
                 <w:noProof/>
                 <w:webHidden/>
               </w:rPr>
-              <w:t>25</w:t>
+              <w:t>38</w:t>
             </w:r>
             <w:r>
               <w:rPr>
@@ -3004,7 +3004,7 @@
           <w:pPr>
             <w:pStyle w:val="TDC2"/>
             <w:tabs>
-              <w:tab w:val="right" w:leader="dot" w:pos="12996"/>
+              <w:tab w:val="right" w:leader="dot" w:pos="8828"/>
             </w:tabs>
             <w:rPr>
               <w:rFonts w:eastAsiaTheme="minorEastAsia"/>
@@ -3012,7 +3012,7 @@
               <w:lang w:eastAsia="es-MX"/>
             </w:rPr>
           </w:pPr>
-          <w:hyperlink w:anchor="_Toc241765607" w:history="1">
+          <w:hyperlink w:anchor="_Toc242456254" w:history="1">
             <w:r>
               <w:rPr>
                 <w:rStyle w:val="Hipervnculo"/>
@@ -3040,7 +3040,7 @@
                 <w:noProof/>
                 <w:webHidden/>
               </w:rPr>
-              <w:instrText xml:space="preserve"> PAGEREF _Toc241765607 \h </w:instrText>
+              <w:instrText xml:space="preserve"> PAGEREF _Toc242456254 \h </w:instrText>
             </w:r>
             <w:r>
               <w:rPr>
@@ -3060,7 +3060,7 @@
                 <w:noProof/>
                 <w:webHidden/>
               </w:rPr>
-              <w:t>25</w:t>
+              <w:t>38</w:t>
             </w:r>
             <w:r>
               <w:rPr>
@@ -3075,7 +3075,7 @@
           <w:pPr>
             <w:pStyle w:val="TDC1"/>
             <w:tabs>
-              <w:tab w:val="right" w:leader="dot" w:pos="12996"/>
+              <w:tab w:val="right" w:leader="dot" w:pos="8828"/>
             </w:tabs>
             <w:rPr>
               <w:rFonts w:eastAsiaTheme="minorEastAsia"/>
@@ -3083,7 +3083,7 @@
               <w:lang w:eastAsia="es-MX"/>
             </w:rPr>
           </w:pPr>
-          <w:hyperlink w:anchor="_Toc241765608" w:history="1">
+          <w:hyperlink w:anchor="_Toc242456255" w:history="1">
             <w:r>
               <w:rPr>
                 <w:rStyle w:val="Hipervnculo"/>
@@ -3110,7 +3110,7 @@
                 <w:noProof/>
                 <w:webHidden/>
               </w:rPr>
-              <w:instrText xml:space="preserve"> PAGEREF _Toc241765608 \h </w:instrText>
+              <w:instrText xml:space="preserve"> PAGEREF _Toc242456255 \h </w:instrText>
             </w:r>
             <w:r>
               <w:rPr>
@@ -3130,7 +3130,7 @@
                 <w:noProof/>
                 <w:webHidden/>
               </w:rPr>
-              <w:t>26</w:t>
+              <w:t>39</w:t>
             </w:r>
             <w:r>
               <w:rPr>
@@ -3145,7 +3145,7 @@
           <w:pPr>
             <w:pStyle w:val="TDC1"/>
             <w:tabs>
-              <w:tab w:val="right" w:leader="dot" w:pos="12996"/>
+              <w:tab w:val="right" w:leader="dot" w:pos="8828"/>
             </w:tabs>
             <w:rPr>
               <w:rFonts w:eastAsiaTheme="minorEastAsia"/>
@@ -3153,7 +3153,7 @@
               <w:lang w:eastAsia="es-MX"/>
             </w:rPr>
           </w:pPr>
-          <w:hyperlink w:anchor="_Toc241765609" w:history="1">
+          <w:hyperlink w:anchor="_Toc242456256" w:history="1">
             <w:r>
               <w:rPr>
                 <w:rStyle w:val="Hipervnculo"/>
@@ -3180,7 +3180,7 @@
                 <w:noProof/>
                 <w:webHidden/>
               </w:rPr>
-              <w:instrText xml:space="preserve"> PAGEREF _Toc241765609 \h </w:instrText>
+              <w:instrText xml:space="preserve"> PAGEREF _Toc242456256 \h </w:instrText>
             </w:r>
             <w:r>
               <w:rPr>
@@ -3200,7 +3200,7 @@
                 <w:noProof/>
                 <w:webHidden/>
               </w:rPr>
-              <w:t>26</w:t>
+              <w:t>39</w:t>
             </w:r>
             <w:r>
               <w:rPr>
@@ -3215,7 +3215,7 @@
           <w:pPr>
             <w:pStyle w:val="TDC2"/>
             <w:tabs>
-              <w:tab w:val="right" w:leader="dot" w:pos="12996"/>
+              <w:tab w:val="right" w:leader="dot" w:pos="8828"/>
             </w:tabs>
             <w:rPr>
               <w:rFonts w:eastAsiaTheme="minorEastAsia"/>
@@ -3223,7 +3223,7 @@
               <w:lang w:eastAsia="es-MX"/>
             </w:rPr>
           </w:pPr>
-          <w:hyperlink w:anchor="_Toc241765610" w:history="1">
+          <w:hyperlink w:anchor="_Toc242456257" w:history="1">
             <w:r>
               <w:rPr>
                 <w:rStyle w:val="Hipervnculo"/>
@@ -3251,7 +3251,7 @@
                 <w:noProof/>
                 <w:webHidden/>
               </w:rPr>
-              <w:instrText xml:space="preserve"> PAGEREF _Toc241765610 \h </w:instrText>
+              <w:instrText xml:space="preserve"> PAGEREF _Toc242456257 \h </w:instrText>
             </w:r>
             <w:r>
               <w:rPr>
@@ -3271,7 +3271,7 @@
                 <w:noProof/>
                 <w:webHidden/>
               </w:rPr>
-              <w:t>26</w:t>
+              <w:t>39</w:t>
             </w:r>
             <w:r>
               <w:rPr>
@@ -3286,7 +3286,7 @@
           <w:pPr>
             <w:pStyle w:val="TDC2"/>
             <w:tabs>
-              <w:tab w:val="right" w:leader="dot" w:pos="12996"/>
+              <w:tab w:val="right" w:leader="dot" w:pos="8828"/>
             </w:tabs>
             <w:rPr>
               <w:rFonts w:eastAsiaTheme="minorEastAsia"/>
@@ -3294,7 +3294,7 @@
               <w:lang w:eastAsia="es-MX"/>
             </w:rPr>
           </w:pPr>
-          <w:hyperlink w:anchor="_Toc241765611" w:history="1">
+          <w:hyperlink w:anchor="_Toc242456258" w:history="1">
             <w:r>
               <w:rPr>
                 <w:rStyle w:val="Hipervnculo"/>
@@ -3322,7 +3322,7 @@
                 <w:noProof/>
                 <w:webHidden/>
               </w:rPr>
-              <w:instrText xml:space="preserve"> PAGEREF _Toc241765611 \h </w:instrText>
+              <w:instrText xml:space="preserve"> PAGEREF _Toc242456258 \h </w:instrText>
             </w:r>
             <w:r>
               <w:rPr>
@@ -3342,7 +3342,7 @@
                 <w:noProof/>
                 <w:webHidden/>
               </w:rPr>
-              <w:t>26</w:t>
+              <w:t>39</w:t>
             </w:r>
             <w:r>
               <w:rPr>
@@ -3357,7 +3357,7 @@
           <w:pPr>
             <w:pStyle w:val="TDC1"/>
             <w:tabs>
-              <w:tab w:val="right" w:leader="dot" w:pos="12996"/>
+              <w:tab w:val="right" w:leader="dot" w:pos="8828"/>
             </w:tabs>
             <w:rPr>
               <w:rFonts w:eastAsiaTheme="minorEastAsia"/>
@@ -3365,7 +3365,7 @@
               <w:lang w:eastAsia="es-MX"/>
             </w:rPr>
           </w:pPr>
-          <w:hyperlink w:anchor="_Toc241765612" w:history="1">
+          <w:hyperlink w:anchor="_Toc242456259" w:history="1">
             <w:r>
               <w:rPr>
                 <w:rStyle w:val="Hipervnculo"/>
@@ -3392,7 +3392,7 @@
                 <w:noProof/>
                 <w:webHidden/>
               </w:rPr>
-              <w:instrText xml:space="preserve"> PAGEREF _Toc241765612 \h </w:instrText>
+              <w:instrText xml:space="preserve"> PAGEREF _Toc242456259 \h </w:instrText>
             </w:r>
             <w:r>
               <w:rPr>
@@ -3412,7 +3412,7 @@
                 <w:noProof/>
                 <w:webHidden/>
               </w:rPr>
-              <w:t>27</w:t>
+              <w:t>39</w:t>
             </w:r>
             <w:r>
               <w:rPr>
@@ -3427,7 +3427,7 @@
           <w:pPr>
             <w:pStyle w:val="TDC2"/>
             <w:tabs>
-              <w:tab w:val="right" w:leader="dot" w:pos="12996"/>
+              <w:tab w:val="right" w:leader="dot" w:pos="8828"/>
             </w:tabs>
             <w:rPr>
               <w:rFonts w:eastAsiaTheme="minorEastAsia"/>
@@ -3435,7 +3435,7 @@
               <w:lang w:eastAsia="es-MX"/>
             </w:rPr>
           </w:pPr>
-          <w:hyperlink w:anchor="_Toc241765613" w:history="1">
+          <w:hyperlink w:anchor="_Toc242456260" w:history="1">
             <w:r>
               <w:rPr>
                 <w:rStyle w:val="Hipervnculo"/>
@@ -3463,7 +3463,7 @@
                 <w:noProof/>
                 <w:webHidden/>
               </w:rPr>
-              <w:instrText xml:space="preserve"> PAGEREF _Toc241765613 \h </w:instrText>
+              <w:instrText xml:space="preserve"> PAGEREF _Toc242456260 \h </w:instrText>
             </w:r>
             <w:r>
               <w:rPr>
@@ -3483,7 +3483,7 @@
                 <w:noProof/>
                 <w:webHidden/>
               </w:rPr>
-              <w:t>27</w:t>
+              <w:t>39</w:t>
             </w:r>
             <w:r>
               <w:rPr>
@@ -3498,7 +3498,7 @@
           <w:pPr>
             <w:pStyle w:val="TDC2"/>
             <w:tabs>
-              <w:tab w:val="right" w:leader="dot" w:pos="12996"/>
+              <w:tab w:val="right" w:leader="dot" w:pos="8828"/>
             </w:tabs>
             <w:rPr>
               <w:rFonts w:eastAsiaTheme="minorEastAsia"/>
@@ -3506,7 +3506,7 @@
               <w:lang w:eastAsia="es-MX"/>
             </w:rPr>
           </w:pPr>
-          <w:hyperlink w:anchor="_Toc241765614" w:history="1">
+          <w:hyperlink w:anchor="_Toc242456261" w:history="1">
             <w:r>
               <w:rPr>
                 <w:rStyle w:val="Hipervnculo"/>
@@ -3534,7 +3534,7 @@
                 <w:noProof/>
                 <w:webHidden/>
               </w:rPr>
-              <w:instrText xml:space="preserve"> PAGEREF _Toc241765614 \h </w:instrText>
+              <w:instrText xml:space="preserve"> PAGEREF _Toc242456261 \h </w:instrText>
             </w:r>
             <w:r>
               <w:rPr>
@@ -3554,7 +3554,7 @@
                 <w:noProof/>
                 <w:webHidden/>
               </w:rPr>
-              <w:t>27</w:t>
+              <w:t>39</w:t>
             </w:r>
             <w:r>
               <w:rPr>
@@ -3569,7 +3569,7 @@
           <w:pPr>
             <w:pStyle w:val="TDC1"/>
             <w:tabs>
-              <w:tab w:val="right" w:leader="dot" w:pos="12996"/>
+              <w:tab w:val="right" w:leader="dot" w:pos="8828"/>
             </w:tabs>
             <w:rPr>
               <w:rFonts w:eastAsiaTheme="minorEastAsia"/>
@@ -3577,7 +3577,7 @@
               <w:lang w:eastAsia="es-MX"/>
             </w:rPr>
           </w:pPr>
-          <w:hyperlink w:anchor="_Toc241765615" w:history="1">
+          <w:hyperlink w:anchor="_Toc242456262" w:history="1">
             <w:r>
               <w:rPr>
                 <w:rStyle w:val="Hipervnculo"/>
@@ -3604,7 +3604,7 @@
                 <w:noProof/>
                 <w:webHidden/>
               </w:rPr>
-              <w:instrText xml:space="preserve"> PAGEREF _Toc241765615 \h </w:instrText>
+              <w:instrText xml:space="preserve"> PAGEREF _Toc242456262 \h </w:instrText>
             </w:r>
             <w:r>
               <w:rPr>
@@ -3624,7 +3624,7 @@
                 <w:noProof/>
                 <w:webHidden/>
               </w:rPr>
-              <w:t>27</w:t>
+              <w:t>40</w:t>
             </w:r>
             <w:r>
               <w:rPr>
@@ -3639,7 +3639,7 @@
           <w:pPr>
             <w:pStyle w:val="TDC2"/>
             <w:tabs>
-              <w:tab w:val="right" w:leader="dot" w:pos="12996"/>
+              <w:tab w:val="right" w:leader="dot" w:pos="8828"/>
             </w:tabs>
             <w:rPr>
               <w:rFonts w:eastAsiaTheme="minorEastAsia"/>
@@ -3647,7 +3647,7 @@
               <w:lang w:eastAsia="es-MX"/>
             </w:rPr>
           </w:pPr>
-          <w:hyperlink w:anchor="_Toc241765616" w:history="1">
+          <w:hyperlink w:anchor="_Toc242456263" w:history="1">
             <w:r>
               <w:rPr>
                 <w:rStyle w:val="Hipervnculo"/>
@@ -3675,7 +3675,7 @@
                 <w:noProof/>
                 <w:webHidden/>
               </w:rPr>
-              <w:instrText xml:space="preserve"> PAGEREF _Toc241765616 \h </w:instrText>
+              <w:instrText xml:space="preserve"> PAGEREF _Toc242456263 \h </w:instrText>
             </w:r>
             <w:r>
               <w:rPr>
@@ -3695,7 +3695,7 @@
                 <w:noProof/>
                 <w:webHidden/>
               </w:rPr>
-              <w:t>27</w:t>
+              <w:t>40</w:t>
             </w:r>
             <w:r>
               <w:rPr>
@@ -3710,7 +3710,7 @@
           <w:pPr>
             <w:pStyle w:val="TDC1"/>
             <w:tabs>
-              <w:tab w:val="right" w:leader="dot" w:pos="12996"/>
+              <w:tab w:val="right" w:leader="dot" w:pos="8828"/>
             </w:tabs>
             <w:rPr>
               <w:rFonts w:eastAsiaTheme="minorEastAsia"/>
@@ -3718,7 +3718,7 @@
               <w:lang w:eastAsia="es-MX"/>
             </w:rPr>
           </w:pPr>
-          <w:hyperlink w:anchor="_Toc241765617" w:history="1">
+          <w:hyperlink w:anchor="_Toc242456264" w:history="1">
             <w:r>
               <w:rPr>
                 <w:rStyle w:val="Hipervnculo"/>
@@ -3745,7 +3745,7 @@
                 <w:noProof/>
                 <w:webHidden/>
               </w:rPr>
-              <w:instrText xml:space="preserve"> PAGEREF _Toc241765617 \h </w:instrText>
+              <w:instrText xml:space="preserve"> PAGEREF _Toc242456264 \h </w:instrText>
             </w:r>
             <w:r>
               <w:rPr>
@@ -3765,7 +3765,7 @@
                 <w:noProof/>
                 <w:webHidden/>
               </w:rPr>
-              <w:t>27</w:t>
+              <w:t>40</w:t>
             </w:r>
             <w:r>
               <w:rPr>
@@ -3780,7 +3780,7 @@
           <w:pPr>
             <w:pStyle w:val="TDC2"/>
             <w:tabs>
-              <w:tab w:val="right" w:leader="dot" w:pos="12996"/>
+              <w:tab w:val="right" w:leader="dot" w:pos="8828"/>
             </w:tabs>
             <w:rPr>
               <w:rFonts w:eastAsiaTheme="minorEastAsia"/>
@@ -3788,7 +3788,7 @@
               <w:lang w:eastAsia="es-MX"/>
             </w:rPr>
           </w:pPr>
-          <w:hyperlink w:anchor="_Toc241765618" w:history="1">
+          <w:hyperlink w:anchor="_Toc242456265" w:history="1">
             <w:r>
               <w:rPr>
                 <w:rStyle w:val="Hipervnculo"/>
@@ -3816,7 +3816,7 @@
                 <w:noProof/>
                 <w:webHidden/>
               </w:rPr>
-              <w:instrText xml:space="preserve"> PAGEREF _Toc241765618 \h </w:instrText>
+              <w:instrText xml:space="preserve"> PAGEREF _Toc242456265 \h </w:instrText>
             </w:r>
             <w:r>
               <w:rPr>
@@ -3836,7 +3836,7 @@
                 <w:noProof/>
                 <w:webHidden/>
               </w:rPr>
-              <w:t>27</w:t>
+              <w:t>40</w:t>
             </w:r>
             <w:r>
               <w:rPr>
@@ -3851,7 +3851,7 @@
           <w:pPr>
             <w:pStyle w:val="TDC2"/>
             <w:tabs>
-              <w:tab w:val="right" w:leader="dot" w:pos="12996"/>
+              <w:tab w:val="right" w:leader="dot" w:pos="8828"/>
             </w:tabs>
             <w:rPr>
               <w:rFonts w:eastAsiaTheme="minorEastAsia"/>
@@ -3859,7 +3859,7 @@
               <w:lang w:eastAsia="es-MX"/>
             </w:rPr>
           </w:pPr>
-          <w:hyperlink w:anchor="_Toc241765619" w:history="1">
+          <w:hyperlink w:anchor="_Toc242456266" w:history="1">
             <w:r>
               <w:rPr>
                 <w:rStyle w:val="Hipervnculo"/>
@@ -3887,7 +3887,7 @@
                 <w:noProof/>
                 <w:webHidden/>
               </w:rPr>
-              <w:instrText xml:space="preserve"> PAGEREF _Toc241765619 \h </w:instrText>
+              <w:instrText xml:space="preserve"> PAGEREF _Toc242456266 \h </w:instrText>
             </w:r>
             <w:r>
               <w:rPr>
@@ -3907,7 +3907,7 @@
                 <w:noProof/>
                 <w:webHidden/>
               </w:rPr>
-              <w:t>28</w:t>
+              <w:t>40</w:t>
             </w:r>
             <w:r>
               <w:rPr>
@@ -3922,7 +3922,7 @@
           <w:pPr>
             <w:pStyle w:val="TDC1"/>
             <w:tabs>
-              <w:tab w:val="right" w:leader="dot" w:pos="12996"/>
+              <w:tab w:val="right" w:leader="dot" w:pos="8828"/>
             </w:tabs>
             <w:rPr>
               <w:rFonts w:eastAsiaTheme="minorEastAsia"/>
@@ -3930,7 +3930,7 @@
               <w:lang w:eastAsia="es-MX"/>
             </w:rPr>
           </w:pPr>
-          <w:hyperlink w:anchor="_Toc241765620" w:history="1">
+          <w:hyperlink w:anchor="_Toc242456267" w:history="1">
             <w:r>
               <w:rPr>
                 <w:rStyle w:val="Hipervnculo"/>
@@ -3957,7 +3957,7 @@
                 <w:noProof/>
                 <w:webHidden/>
               </w:rPr>
-              <w:instrText xml:space="preserve"> PAGEREF _Toc241765620 \h </w:instrText>
+              <w:instrText xml:space="preserve"> PAGEREF _Toc242456267 \h </w:instrText>
             </w:r>
             <w:r>
               <w:rPr>
@@ -3977,7 +3977,7 @@
                 <w:noProof/>
                 <w:webHidden/>
               </w:rPr>
-              <w:t>28</w:t>
+              <w:t>40</w:t>
             </w:r>
             <w:r>
               <w:rPr>
@@ -3992,7 +3992,7 @@
           <w:pPr>
             <w:pStyle w:val="TDC2"/>
             <w:tabs>
-              <w:tab w:val="right" w:leader="dot" w:pos="12996"/>
+              <w:tab w:val="right" w:leader="dot" w:pos="8828"/>
             </w:tabs>
             <w:rPr>
               <w:rFonts w:eastAsiaTheme="minorEastAsia"/>
@@ -4000,7 +4000,7 @@
               <w:lang w:eastAsia="es-MX"/>
             </w:rPr>
           </w:pPr>
-          <w:hyperlink w:anchor="_Toc241765621" w:history="1">
+          <w:hyperlink w:anchor="_Toc242456268" w:history="1">
             <w:r>
               <w:rPr>
                 <w:rStyle w:val="Hipervnculo"/>
@@ -4028,7 +4028,7 @@
                 <w:noProof/>
                 <w:webHidden/>
               </w:rPr>
-              <w:instrText xml:space="preserve"> PAGEREF _Toc241765621 \h </w:instrText>
+              <w:instrText xml:space="preserve"> PAGEREF _Toc242456268 \h </w:instrText>
             </w:r>
             <w:r>
               <w:rPr>
@@ -4048,7 +4048,7 @@
                 <w:noProof/>
                 <w:webHidden/>
               </w:rPr>
-              <w:t>28</w:t>
+              <w:t>40</w:t>
             </w:r>
             <w:r>
               <w:rPr>
@@ -4063,7 +4063,7 @@
           <w:pPr>
             <w:pStyle w:val="TDC2"/>
             <w:tabs>
-              <w:tab w:val="right" w:leader="dot" w:pos="12996"/>
+              <w:tab w:val="right" w:leader="dot" w:pos="8828"/>
             </w:tabs>
             <w:rPr>
               <w:rFonts w:eastAsiaTheme="minorEastAsia"/>
@@ -4071,7 +4071,7 @@
               <w:lang w:eastAsia="es-MX"/>
             </w:rPr>
           </w:pPr>
-          <w:hyperlink w:anchor="_Toc241765622" w:history="1">
+          <w:hyperlink w:anchor="_Toc242456269" w:history="1">
             <w:r>
               <w:rPr>
                 <w:rStyle w:val="Hipervnculo"/>
@@ -4099,7 +4099,7 @@
                 <w:noProof/>
                 <w:webHidden/>
               </w:rPr>
-              <w:instrText xml:space="preserve"> PAGEREF _Toc241765622 \h </w:instrText>
+              <w:instrText xml:space="preserve"> PAGEREF _Toc242456269 \h </w:instrText>
             </w:r>
             <w:r>
               <w:rPr>
@@ -4119,7 +4119,7 @@
                 <w:noProof/>
                 <w:webHidden/>
               </w:rPr>
-              <w:t>28</w:t>
+              <w:t>41</w:t>
             </w:r>
             <w:r>
               <w:rPr>
@@ -4134,7 +4134,7 @@
           <w:pPr>
             <w:pStyle w:val="TDC1"/>
             <w:tabs>
-              <w:tab w:val="right" w:leader="dot" w:pos="12996"/>
+              <w:tab w:val="right" w:leader="dot" w:pos="8828"/>
             </w:tabs>
             <w:rPr>
               <w:rFonts w:eastAsiaTheme="minorEastAsia"/>
@@ -4142,7 +4142,7 @@
               <w:lang w:eastAsia="es-MX"/>
             </w:rPr>
           </w:pPr>
-          <w:hyperlink w:anchor="_Toc241765623" w:history="1">
+          <w:hyperlink w:anchor="_Toc242456270" w:history="1">
             <w:r>
               <w:rPr>
                 <w:rStyle w:val="Hipervnculo"/>
@@ -4169,7 +4169,7 @@
                 <w:noProof/>
                 <w:webHidden/>
               </w:rPr>
-              <w:instrText xml:space="preserve"> PAGEREF _Toc241765623 \h </w:instrText>
+              <w:instrText xml:space="preserve"> PAGEREF _Toc242456270 \h </w:instrText>
             </w:r>
             <w:r>
               <w:rPr>
@@ -4189,7 +4189,7 @@
                 <w:noProof/>
                 <w:webHidden/>
               </w:rPr>
-              <w:t>29</w:t>
+              <w:t>41</w:t>
             </w:r>
             <w:r>
               <w:rPr>
@@ -4204,7 +4204,7 @@
           <w:pPr>
             <w:pStyle w:val="TDC2"/>
             <w:tabs>
-              <w:tab w:val="right" w:leader="dot" w:pos="12996"/>
+              <w:tab w:val="right" w:leader="dot" w:pos="8828"/>
             </w:tabs>
             <w:rPr>
               <w:rFonts w:eastAsiaTheme="minorEastAsia"/>
@@ -4212,7 +4212,7 @@
               <w:lang w:eastAsia="es-MX"/>
             </w:rPr>
           </w:pPr>
-          <w:hyperlink w:anchor="_Toc241765624" w:history="1">
+          <w:hyperlink w:anchor="_Toc242456271" w:history="1">
             <w:r>
               <w:rPr>
                 <w:rStyle w:val="Hipervnculo"/>
@@ -4240,7 +4240,7 @@
                 <w:noProof/>
                 <w:webHidden/>
               </w:rPr>
-              <w:instrText xml:space="preserve"> PAGEREF _Toc241765624 \h </w:instrText>
+              <w:instrText xml:space="preserve"> PAGEREF _Toc242456271 \h </w:instrText>
             </w:r>
             <w:r>
               <w:rPr>
@@ -4260,7 +4260,7 @@
                 <w:noProof/>
                 <w:webHidden/>
               </w:rPr>
-              <w:t>29</w:t>
+              <w:t>41</w:t>
             </w:r>
             <w:r>
               <w:rPr>
@@ -4275,7 +4275,7 @@
           <w:pPr>
             <w:pStyle w:val="TDC2"/>
             <w:tabs>
-              <w:tab w:val="right" w:leader="dot" w:pos="12996"/>
+              <w:tab w:val="right" w:leader="dot" w:pos="8828"/>
             </w:tabs>
             <w:rPr>
               <w:rFonts w:eastAsiaTheme="minorEastAsia"/>
@@ -4283,7 +4283,7 @@
               <w:lang w:eastAsia="es-MX"/>
             </w:rPr>
           </w:pPr>
-          <w:hyperlink w:anchor="_Toc241765625" w:history="1">
+          <w:hyperlink w:anchor="_Toc242456272" w:history="1">
             <w:r>
               <w:rPr>
                 <w:rStyle w:val="Hipervnculo"/>
@@ -4311,7 +4311,7 @@
                 <w:noProof/>
                 <w:webHidden/>
               </w:rPr>
-              <w:instrText xml:space="preserve"> PAGEREF _Toc241765625 \h </w:instrText>
+              <w:instrText xml:space="preserve"> PAGEREF _Toc242456272 \h </w:instrText>
             </w:r>
             <w:r>
               <w:rPr>
@@ -4331,7 +4331,7 @@
                 <w:noProof/>
                 <w:webHidden/>
               </w:rPr>
-              <w:t>29</w:t>
+              <w:t>41</w:t>
             </w:r>
             <w:r>
               <w:rPr>
@@ -4346,7 +4346,7 @@
           <w:pPr>
             <w:pStyle w:val="TDC1"/>
             <w:tabs>
-              <w:tab w:val="right" w:leader="dot" w:pos="12996"/>
+              <w:tab w:val="right" w:leader="dot" w:pos="8828"/>
             </w:tabs>
             <w:rPr>
               <w:rFonts w:eastAsiaTheme="minorEastAsia"/>
@@ -4354,7 +4354,7 @@
               <w:lang w:eastAsia="es-MX"/>
             </w:rPr>
           </w:pPr>
-          <w:hyperlink w:anchor="_Toc241765626" w:history="1">
+          <w:hyperlink w:anchor="_Toc242456273" w:history="1">
             <w:r>
               <w:rPr>
                 <w:rStyle w:val="Hipervnculo"/>
@@ -4381,7 +4381,7 @@
                 <w:noProof/>
                 <w:webHidden/>
               </w:rPr>
-              <w:instrText xml:space="preserve"> PAGEREF _Toc241765626 \h </w:instrText>
+              <w:instrText xml:space="preserve"> PAGEREF _Toc242456273 \h </w:instrText>
             </w:r>
             <w:r>
               <w:rPr>
@@ -4401,7 +4401,7 @@
                 <w:noProof/>
                 <w:webHidden/>
               </w:rPr>
-              <w:t>29</w:t>
+              <w:t>41</w:t>
             </w:r>
             <w:r>
               <w:rPr>
@@ -4416,7 +4416,7 @@
           <w:pPr>
             <w:pStyle w:val="TDC2"/>
             <w:tabs>
-              <w:tab w:val="right" w:leader="dot" w:pos="12996"/>
+              <w:tab w:val="right" w:leader="dot" w:pos="8828"/>
             </w:tabs>
             <w:rPr>
               <w:rFonts w:eastAsiaTheme="minorEastAsia"/>
@@ -4424,7 +4424,7 @@
               <w:lang w:eastAsia="es-MX"/>
             </w:rPr>
           </w:pPr>
-          <w:hyperlink w:anchor="_Toc241765627" w:history="1">
+          <w:hyperlink w:anchor="_Toc242456274" w:history="1">
             <w:r>
               <w:rPr>
                 <w:rStyle w:val="Hipervnculo"/>
@@ -4452,7 +4452,7 @@
                 <w:noProof/>
                 <w:webHidden/>
               </w:rPr>
-              <w:instrText xml:space="preserve"> PAGEREF _Toc241765627 \h </w:instrText>
+              <w:instrText xml:space="preserve"> PAGEREF _Toc242456274 \h </w:instrText>
             </w:r>
             <w:r>
               <w:rPr>
@@ -4472,7 +4472,7 @@
                 <w:noProof/>
                 <w:webHidden/>
               </w:rPr>
-              <w:t>29</w:t>
+              <w:t>41</w:t>
             </w:r>
             <w:r>
               <w:rPr>
@@ -4487,7 +4487,7 @@
           <w:pPr>
             <w:pStyle w:val="TDC2"/>
             <w:tabs>
-              <w:tab w:val="right" w:leader="dot" w:pos="12996"/>
+              <w:tab w:val="right" w:leader="dot" w:pos="8828"/>
             </w:tabs>
             <w:rPr>
               <w:rFonts w:eastAsiaTheme="minorEastAsia"/>
@@ -4495,7 +4495,7 @@
               <w:lang w:eastAsia="es-MX"/>
             </w:rPr>
           </w:pPr>
-          <w:hyperlink w:anchor="_Toc241765628" w:history="1">
+          <w:hyperlink w:anchor="_Toc242456275" w:history="1">
             <w:r>
               <w:rPr>
                 <w:rStyle w:val="Hipervnculo"/>
@@ -4523,7 +4523,7 @@
                 <w:noProof/>
                 <w:webHidden/>
               </w:rPr>
-              <w:instrText xml:space="preserve"> PAGEREF _Toc241765628 \h </w:instrText>
+              <w:instrText xml:space="preserve"> PAGEREF _Toc242456275 \h </w:instrText>
             </w:r>
             <w:r>
               <w:rPr>
@@ -4543,7 +4543,7 @@
                 <w:noProof/>
                 <w:webHidden/>
               </w:rPr>
-              <w:t>29</w:t>
+              <w:t>42</w:t>
             </w:r>
             <w:r>
               <w:rPr>
@@ -4558,7 +4558,7 @@
           <w:pPr>
             <w:pStyle w:val="TDC1"/>
             <w:tabs>
-              <w:tab w:val="right" w:leader="dot" w:pos="12996"/>
+              <w:tab w:val="right" w:leader="dot" w:pos="8828"/>
             </w:tabs>
             <w:rPr>
               <w:rFonts w:eastAsiaTheme="minorEastAsia"/>
@@ -4566,7 +4566,7 @@
               <w:lang w:eastAsia="es-MX"/>
             </w:rPr>
           </w:pPr>
-          <w:hyperlink w:anchor="_Toc241765629" w:history="1">
+          <w:hyperlink w:anchor="_Toc242456276" w:history="1">
             <w:r>
               <w:rPr>
                 <w:rStyle w:val="Hipervnculo"/>
@@ -4593,7 +4593,7 @@
                 <w:noProof/>
                 <w:webHidden/>
               </w:rPr>
-              <w:instrText xml:space="preserve"> PAGEREF _Toc241765629 \h </w:instrText>
+              <w:instrText xml:space="preserve"> PAGEREF _Toc242456276 \h </w:instrText>
             </w:r>
             <w:r>
               <w:rPr>
@@ -4613,7 +4613,7 @@
                 <w:noProof/>
                 <w:webHidden/>
               </w:rPr>
-              <w:t>30</w:t>
+              <w:t>42</w:t>
             </w:r>
             <w:r>
               <w:rPr>
@@ -4628,7 +4628,7 @@
           <w:pPr>
             <w:pStyle w:val="TDC2"/>
             <w:tabs>
-              <w:tab w:val="right" w:leader="dot" w:pos="12996"/>
+              <w:tab w:val="right" w:leader="dot" w:pos="8828"/>
             </w:tabs>
             <w:rPr>
               <w:rFonts w:eastAsiaTheme="minorEastAsia"/>
@@ -4636,7 +4636,7 @@
               <w:lang w:eastAsia="es-MX"/>
             </w:rPr>
           </w:pPr>
-          <w:hyperlink w:anchor="_Toc241765630" w:history="1">
+          <w:hyperlink w:anchor="_Toc242456277" w:history="1">
             <w:r>
               <w:rPr>
                 <w:rStyle w:val="Hipervnculo"/>
@@ -4664,7 +4664,7 @@
                 <w:noProof/>
                 <w:webHidden/>
               </w:rPr>
-              <w:instrText xml:space="preserve"> PAGEREF _Toc241765630 \h </w:instrText>
+              <w:instrText xml:space="preserve"> PAGEREF _Toc242456277 \h </w:instrText>
             </w:r>
             <w:r>
               <w:rPr>
@@ -4684,7 +4684,7 @@
                 <w:noProof/>
                 <w:webHidden/>
               </w:rPr>
-              <w:t>30</w:t>
+              <w:t>42</w:t>
             </w:r>
             <w:r>
               <w:rPr>
@@ -4699,7 +4699,7 @@
           <w:pPr>
             <w:pStyle w:val="TDC1"/>
             <w:tabs>
-              <w:tab w:val="right" w:leader="dot" w:pos="12996"/>
+              <w:tab w:val="right" w:leader="dot" w:pos="8828"/>
             </w:tabs>
             <w:rPr>
               <w:rFonts w:eastAsiaTheme="minorEastAsia"/>
@@ -4707,7 +4707,7 @@
               <w:lang w:eastAsia="es-MX"/>
             </w:rPr>
           </w:pPr>
-          <w:hyperlink w:anchor="_Toc241765631" w:history="1">
+          <w:hyperlink w:anchor="_Toc242456278" w:history="1">
             <w:r>
               <w:rPr>
                 <w:rStyle w:val="Hipervnculo"/>
@@ -4734,7 +4734,7 @@
                 <w:noProof/>
                 <w:webHidden/>
               </w:rPr>
-              <w:instrText xml:space="preserve"> PAGEREF _Toc241765631 \h </w:instrText>
+              <w:instrText xml:space="preserve"> PAGEREF _Toc242456278 \h </w:instrText>
             </w:r>
             <w:r>
               <w:rPr>
@@ -4754,7 +4754,7 @@
                 <w:noProof/>
                 <w:webHidden/>
               </w:rPr>
-              <w:t>30</w:t>
+              <w:t>42</w:t>
             </w:r>
             <w:r>
               <w:rPr>
@@ -4769,7 +4769,7 @@
           <w:pPr>
             <w:pStyle w:val="TDC2"/>
             <w:tabs>
-              <w:tab w:val="right" w:leader="dot" w:pos="12996"/>
+              <w:tab w:val="right" w:leader="dot" w:pos="8828"/>
             </w:tabs>
             <w:rPr>
               <w:rFonts w:eastAsiaTheme="minorEastAsia"/>
@@ -4777,7 +4777,7 @@
               <w:lang w:eastAsia="es-MX"/>
             </w:rPr>
           </w:pPr>
-          <w:hyperlink w:anchor="_Toc241765632" w:history="1">
+          <w:hyperlink w:anchor="_Toc242456279" w:history="1">
             <w:r>
               <w:rPr>
                 <w:rStyle w:val="Hipervnculo"/>
@@ -4805,7 +4805,7 @@
                 <w:noProof/>
                 <w:webHidden/>
               </w:rPr>
-              <w:instrText xml:space="preserve"> PAGEREF _Toc241765632 \h </w:instrText>
+              <w:instrText xml:space="preserve"> PAGEREF _Toc242456279 \h </w:instrText>
             </w:r>
             <w:r>
               <w:rPr>
@@ -4825,7 +4825,7 @@
                 <w:noProof/>
                 <w:webHidden/>
               </w:rPr>
-              <w:t>30</w:t>
+              <w:t>42</w:t>
             </w:r>
             <w:r>
               <w:rPr>
@@ -4840,7 +4840,7 @@
           <w:pPr>
             <w:pStyle w:val="TDC2"/>
             <w:tabs>
-              <w:tab w:val="right" w:leader="dot" w:pos="12996"/>
+              <w:tab w:val="right" w:leader="dot" w:pos="8828"/>
             </w:tabs>
             <w:rPr>
               <w:rFonts w:eastAsiaTheme="minorEastAsia"/>
@@ -4848,7 +4848,7 @@
               <w:lang w:eastAsia="es-MX"/>
             </w:rPr>
           </w:pPr>
-          <w:hyperlink w:anchor="_Toc241765633" w:history="1">
+          <w:hyperlink w:anchor="_Toc242456280" w:history="1">
             <w:r>
               <w:rPr>
                 <w:rStyle w:val="Hipervnculo"/>
@@ -4876,7 +4876,7 @@
                 <w:noProof/>
                 <w:webHidden/>
               </w:rPr>
-              <w:instrText xml:space="preserve"> PAGEREF _Toc241765633 \h </w:instrText>
+              <w:instrText xml:space="preserve"> PAGEREF _Toc242456280 \h </w:instrText>
             </w:r>
             <w:r>
               <w:rPr>
@@ -4896,7 +4896,7 @@
                 <w:noProof/>
                 <w:webHidden/>
               </w:rPr>
-              <w:t>30</w:t>
+              <w:t>42</w:t>
             </w:r>
             <w:r>
               <w:rPr>
@@ -4911,7 +4911,7 @@
           <w:pPr>
             <w:pStyle w:val="TDC2"/>
             <w:tabs>
-              <w:tab w:val="right" w:leader="dot" w:pos="12996"/>
+              <w:tab w:val="right" w:leader="dot" w:pos="8828"/>
             </w:tabs>
             <w:rPr>
               <w:rFonts w:eastAsiaTheme="minorEastAsia"/>
@@ -4919,7 +4919,7 @@
               <w:lang w:eastAsia="es-MX"/>
             </w:rPr>
           </w:pPr>
-          <w:hyperlink w:anchor="_Toc241765634" w:history="1">
+          <w:hyperlink w:anchor="_Toc242456281" w:history="1">
             <w:r>
               <w:rPr>
                 <w:rStyle w:val="Hipervnculo"/>
@@ -4947,7 +4947,7 @@
                 <w:noProof/>
                 <w:webHidden/>
               </w:rPr>
-              <w:instrText xml:space="preserve"> PAGEREF _Toc241765634 \h </w:instrText>
+              <w:instrText xml:space="preserve"> PAGEREF _Toc242456281 \h </w:instrText>
             </w:r>
             <w:r>
               <w:rPr>
@@ -4967,7 +4967,7 @@
                 <w:noProof/>
                 <w:webHidden/>
               </w:rPr>
-              <w:t>31</w:t>
+              <w:t>42</w:t>
             </w:r>
             <w:r>
               <w:rPr>
@@ -4982,7 +4982,7 @@
           <w:pPr>
             <w:pStyle w:val="TDC2"/>
             <w:tabs>
-              <w:tab w:val="right" w:leader="dot" w:pos="12996"/>
+              <w:tab w:val="right" w:leader="dot" w:pos="8828"/>
             </w:tabs>
             <w:rPr>
               <w:rFonts w:eastAsiaTheme="minorEastAsia"/>
@@ -4990,7 +4990,7 @@
               <w:lang w:eastAsia="es-MX"/>
             </w:rPr>
           </w:pPr>
-          <w:hyperlink w:anchor="_Toc241765635" w:history="1">
+          <w:hyperlink w:anchor="_Toc242456282" w:history="1">
             <w:r>
               <w:rPr>
                 <w:rStyle w:val="Hipervnculo"/>
@@ -5018,7 +5018,7 @@
                 <w:noProof/>
                 <w:webHidden/>
               </w:rPr>
-              <w:instrText xml:space="preserve"> PAGEREF _Toc241765635 \h </w:instrText>
+              <w:instrText xml:space="preserve"> PAGEREF _Toc242456282 \h </w:instrText>
             </w:r>
             <w:r>
               <w:rPr>
@@ -5038,7 +5038,7 @@
                 <w:noProof/>
                 <w:webHidden/>
               </w:rPr>
-              <w:t>31</w:t>
+              <w:t>43</w:t>
             </w:r>
             <w:r>
               <w:rPr>
@@ -5053,7 +5053,7 @@
           <w:pPr>
             <w:pStyle w:val="TDC1"/>
             <w:tabs>
-              <w:tab w:val="right" w:leader="dot" w:pos="12996"/>
+              <w:tab w:val="right" w:leader="dot" w:pos="8828"/>
             </w:tabs>
             <w:rPr>
               <w:rFonts w:eastAsiaTheme="minorEastAsia"/>
@@ -5061,7 +5061,7 @@
               <w:lang w:eastAsia="es-MX"/>
             </w:rPr>
           </w:pPr>
-          <w:hyperlink w:anchor="_Toc241765636" w:history="1">
+          <w:hyperlink w:anchor="_Toc242456283" w:history="1">
             <w:r>
               <w:rPr>
                 <w:rStyle w:val="Hipervnculo"/>
@@ -5088,7 +5088,7 @@
                 <w:noProof/>
                 <w:webHidden/>
               </w:rPr>
-              <w:instrText xml:space="preserve"> PAGEREF _Toc241765636 \h </w:instrText>
+              <w:instrText xml:space="preserve"> PAGEREF _Toc242456283 \h </w:instrText>
             </w:r>
             <w:r>
               <w:rPr>
@@ -5108,7 +5108,7 @@
                 <w:noProof/>
                 <w:webHidden/>
               </w:rPr>
-              <w:t>31</w:t>
+              <w:t>43</w:t>
             </w:r>
             <w:r>
               <w:rPr>
@@ -5123,7 +5123,7 @@
           <w:pPr>
             <w:pStyle w:val="TDC2"/>
             <w:tabs>
-              <w:tab w:val="right" w:leader="dot" w:pos="12996"/>
+              <w:tab w:val="right" w:leader="dot" w:pos="8828"/>
             </w:tabs>
             <w:rPr>
               <w:rFonts w:eastAsiaTheme="minorEastAsia"/>
@@ -5131,7 +5131,7 @@
               <w:lang w:eastAsia="es-MX"/>
             </w:rPr>
           </w:pPr>
-          <w:hyperlink w:anchor="_Toc241765637" w:history="1">
+          <w:hyperlink w:anchor="_Toc242456284" w:history="1">
             <w:r>
               <w:rPr>
                 <w:rStyle w:val="Hipervnculo"/>
@@ -5159,7 +5159,7 @@
                 <w:noProof/>
                 <w:webHidden/>
               </w:rPr>
-              <w:instrText xml:space="preserve"> PAGEREF _Toc241765637 \h </w:instrText>
+              <w:instrText xml:space="preserve"> PAGEREF _Toc242456284 \h </w:instrText>
             </w:r>
             <w:r>
               <w:rPr>
@@ -5179,7 +5179,7 @@
                 <w:noProof/>
                 <w:webHidden/>
               </w:rPr>
-              <w:t>31</w:t>
+              <w:t>43</w:t>
             </w:r>
             <w:r>
               <w:rPr>
@@ -5194,7 +5194,7 @@
           <w:pPr>
             <w:pStyle w:val="TDC1"/>
             <w:tabs>
-              <w:tab w:val="right" w:leader="dot" w:pos="12996"/>
+              <w:tab w:val="right" w:leader="dot" w:pos="8828"/>
             </w:tabs>
             <w:rPr>
               <w:rFonts w:eastAsiaTheme="minorEastAsia"/>
@@ -5202,7 +5202,7 @@
               <w:lang w:eastAsia="es-MX"/>
             </w:rPr>
           </w:pPr>
-          <w:hyperlink w:anchor="_Toc241765638" w:history="1">
+          <w:hyperlink w:anchor="_Toc242456285" w:history="1">
             <w:r>
               <w:rPr>
                 <w:rStyle w:val="Hipervnculo"/>
@@ -5229,7 +5229,7 @@
                 <w:noProof/>
                 <w:webHidden/>
               </w:rPr>
-              <w:instrText xml:space="preserve"> PAGEREF _Toc241765638 \h </w:instrText>
+              <w:instrText xml:space="preserve"> PAGEREF _Toc242456285 \h </w:instrText>
             </w:r>
             <w:r>
               <w:rPr>
@@ -5249,7 +5249,7 @@
                 <w:noProof/>
                 <w:webHidden/>
               </w:rPr>
-              <w:t>32</w:t>
+              <w:t>43</w:t>
             </w:r>
             <w:r>
               <w:rPr>
@@ -5264,7 +5264,7 @@
           <w:pPr>
             <w:pStyle w:val="TDC2"/>
             <w:tabs>
-              <w:tab w:val="right" w:leader="dot" w:pos="12996"/>
+              <w:tab w:val="right" w:leader="dot" w:pos="8828"/>
             </w:tabs>
             <w:rPr>
               <w:rFonts w:eastAsiaTheme="minorEastAsia"/>
@@ -5272,7 +5272,7 @@
               <w:lang w:eastAsia="es-MX"/>
             </w:rPr>
           </w:pPr>
-          <w:hyperlink w:anchor="_Toc241765639" w:history="1">
+          <w:hyperlink w:anchor="_Toc242456286" w:history="1">
             <w:r>
               <w:rPr>
                 <w:rStyle w:val="Hipervnculo"/>
@@ -5300,7 +5300,7 @@
                 <w:noProof/>
                 <w:webHidden/>
               </w:rPr>
-              <w:instrText xml:space="preserve"> PAGEREF _Toc241765639 \h </w:instrText>
+              <w:instrText xml:space="preserve"> PAGEREF _Toc242456286 \h </w:instrText>
             </w:r>
             <w:r>
               <w:rPr>
@@ -5320,7 +5320,7 @@
                 <w:noProof/>
                 <w:webHidden/>
               </w:rPr>
-              <w:t>32</w:t>
+              <w:t>43</w:t>
             </w:r>
             <w:r>
               <w:rPr>
@@ -5498,7 +5498,7 @@
           <w:rFonts w:asciiTheme="minorHAnsi" w:hAnsiTheme="minorHAnsi" w:cstheme="minorHAnsi"/>
         </w:rPr>
       </w:pPr>
-      <w:bookmarkStart w:id="0" w:name="_Toc241765566"/>
+      <w:bookmarkStart w:id="0" w:name="_Toc242456213"/>
       <w:r>
         <w:rPr>
           <w:rFonts w:asciiTheme="minorHAnsi" w:hAnsiTheme="minorHAnsi" w:cstheme="minorHAnsi"/>
@@ -5580,7 +5580,7 @@
           <w:rFonts w:asciiTheme="minorHAnsi" w:hAnsiTheme="minorHAnsi" w:cstheme="minorHAnsi"/>
         </w:rPr>
       </w:pPr>
-      <w:bookmarkStart w:id="1" w:name="_Toc241765567"/>
+      <w:bookmarkStart w:id="1" w:name="_Toc242456214"/>
       <w:r>
         <w:rPr>
           <w:rFonts w:asciiTheme="minorHAnsi" w:hAnsiTheme="minorHAnsi" w:cstheme="minorHAnsi"/>
@@ -5808,7 +5808,7 @@
           <w:rFonts w:asciiTheme="minorHAnsi" w:hAnsiTheme="minorHAnsi" w:cstheme="minorHAnsi"/>
         </w:rPr>
       </w:pPr>
-      <w:bookmarkStart w:id="2" w:name="_Toc241765568"/>
+      <w:bookmarkStart w:id="2" w:name="_Toc242456215"/>
       <w:r>
         <w:rPr>
           <w:rFonts w:asciiTheme="minorHAnsi" w:hAnsiTheme="minorHAnsi" w:cstheme="minorHAnsi"/>
@@ -5935,7 +5935,7 @@
           <w:lang w:eastAsia="es-MX"/>
         </w:rPr>
       </w:pPr>
-      <w:bookmarkStart w:id="3" w:name="_Toc241765569"/>
+      <w:bookmarkStart w:id="3" w:name="_Toc242456216"/>
       <w:r>
         <w:rPr>
           <w:rFonts w:asciiTheme="minorHAnsi" w:eastAsia="Times New Roman" w:hAnsiTheme="minorHAnsi" w:cstheme="minorHAnsi"/>
@@ -6259,7 +6259,7 @@
           <w:lang w:eastAsia="es-MX"/>
         </w:rPr>
       </w:pPr>
-      <w:bookmarkStart w:id="4" w:name="_Toc241765570"/>
+      <w:bookmarkStart w:id="4" w:name="_Toc242456217"/>
       <w:r>
         <w:rPr>
           <w:rFonts w:asciiTheme="minorHAnsi" w:eastAsia="Times New Roman" w:hAnsiTheme="minorHAnsi" w:cstheme="minorHAnsi"/>
@@ -6489,7 +6489,7 @@
           <w:lang w:eastAsia="es-MX"/>
         </w:rPr>
       </w:pPr>
-      <w:bookmarkStart w:id="5" w:name="_Toc241765571"/>
+      <w:bookmarkStart w:id="5" w:name="_Toc242456218"/>
       <w:r>
         <w:rPr>
           <w:rFonts w:asciiTheme="minorHAnsi" w:eastAsia="Times New Roman" w:hAnsiTheme="minorHAnsi" w:cstheme="minorHAnsi"/>
@@ -7138,7 +7138,7 @@
           <w:rFonts w:asciiTheme="minorHAnsi" w:hAnsiTheme="minorHAnsi" w:cstheme="minorHAnsi"/>
         </w:rPr>
       </w:pPr>
-      <w:bookmarkStart w:id="6" w:name="_Toc241765572"/>
+      <w:bookmarkStart w:id="6" w:name="_Toc242456219"/>
       <w:r>
         <w:rPr>
           <w:rFonts w:asciiTheme="minorHAnsi" w:hAnsiTheme="minorHAnsi" w:cstheme="minorHAnsi"/>
@@ -7789,7 +7789,7 @@
           <w:rFonts w:asciiTheme="minorHAnsi" w:hAnsiTheme="minorHAnsi" w:cstheme="minorHAnsi"/>
         </w:rPr>
       </w:pPr>
-      <w:bookmarkStart w:id="7" w:name="_Toc241765573"/>
+      <w:bookmarkStart w:id="7" w:name="_Toc242456220"/>
       <w:r>
         <w:rPr>
           <w:rFonts w:asciiTheme="minorHAnsi" w:hAnsiTheme="minorHAnsi" w:cstheme="minorHAnsi"/>
@@ -7870,7 +7870,7 @@
           <w:rFonts w:asciiTheme="minorHAnsi" w:hAnsiTheme="minorHAnsi" w:cstheme="minorHAnsi"/>
         </w:rPr>
       </w:pPr>
-      <w:bookmarkStart w:id="8" w:name="_Toc241765574"/>
+      <w:bookmarkStart w:id="8" w:name="_Toc242456221"/>
       <w:r>
         <w:rPr>
           <w:rFonts w:asciiTheme="minorHAnsi" w:hAnsiTheme="minorHAnsi" w:cstheme="minorHAnsi"/>
@@ -8018,7 +8018,7 @@
           <w:rFonts w:asciiTheme="minorHAnsi" w:hAnsiTheme="minorHAnsi" w:cstheme="minorHAnsi"/>
         </w:rPr>
       </w:pPr>
-      <w:bookmarkStart w:id="9" w:name="_Toc241765575"/>
+      <w:bookmarkStart w:id="9" w:name="_Toc242456222"/>
       <w:r>
         <w:rPr>
           <w:rFonts w:asciiTheme="minorHAnsi" w:hAnsiTheme="minorHAnsi" w:cstheme="minorHAnsi"/>
@@ -8417,7 +8417,7 @@
           <w:rFonts w:asciiTheme="minorHAnsi" w:hAnsiTheme="minorHAnsi" w:cstheme="minorHAnsi"/>
         </w:rPr>
       </w:pPr>
-      <w:bookmarkStart w:id="10" w:name="_Toc241765576"/>
+      <w:bookmarkStart w:id="10" w:name="_Toc242456223"/>
       <w:r>
         <w:rPr>
           <w:rFonts w:asciiTheme="minorHAnsi" w:hAnsiTheme="minorHAnsi" w:cstheme="minorHAnsi"/>
@@ -8662,7 +8662,7 @@
           <w:rFonts w:asciiTheme="minorHAnsi" w:hAnsiTheme="minorHAnsi" w:cstheme="minorHAnsi"/>
         </w:rPr>
       </w:pPr>
-      <w:bookmarkStart w:id="11" w:name="_Toc241765577"/>
+      <w:bookmarkStart w:id="11" w:name="_Toc242456224"/>
       <w:r>
         <w:rPr>
           <w:rFonts w:asciiTheme="minorHAnsi" w:hAnsiTheme="minorHAnsi" w:cstheme="minorHAnsi"/>
@@ -8832,7 +8832,7 @@
           <w:rFonts w:asciiTheme="minorHAnsi" w:hAnsiTheme="minorHAnsi" w:cstheme="minorHAnsi"/>
         </w:rPr>
       </w:pPr>
-      <w:bookmarkStart w:id="12" w:name="_Toc241765578"/>
+      <w:bookmarkStart w:id="12" w:name="_Toc242456225"/>
       <w:r>
         <w:rPr>
           <w:rFonts w:asciiTheme="minorHAnsi" w:hAnsiTheme="minorHAnsi" w:cstheme="minorHAnsi"/>
@@ -9582,7 +9582,7 @@
           <w:rFonts w:asciiTheme="minorHAnsi" w:hAnsiTheme="minorHAnsi" w:cstheme="minorHAnsi"/>
         </w:rPr>
       </w:pPr>
-      <w:bookmarkStart w:id="13" w:name="_Toc241765579"/>
+      <w:bookmarkStart w:id="13" w:name="_Toc242456226"/>
       <w:r>
         <w:rPr>
           <w:rFonts w:asciiTheme="minorHAnsi" w:hAnsiTheme="minorHAnsi" w:cstheme="minorHAnsi"/>
@@ -9916,7 +9916,7 @@
           <w:rFonts w:asciiTheme="minorHAnsi" w:hAnsiTheme="minorHAnsi" w:cstheme="minorHAnsi"/>
         </w:rPr>
       </w:pPr>
-      <w:bookmarkStart w:id="14" w:name="_Toc241765580"/>
+      <w:bookmarkStart w:id="14" w:name="_Toc242456227"/>
       <w:r>
         <w:rPr>
           <w:rFonts w:asciiTheme="minorHAnsi" w:hAnsiTheme="minorHAnsi" w:cstheme="minorHAnsi"/>
@@ -10124,7 +10124,7 @@
           <w:lang w:eastAsia="es-MX"/>
         </w:rPr>
       </w:pPr>
-      <w:bookmarkStart w:id="15" w:name="_Toc241765581"/>
+      <w:bookmarkStart w:id="15" w:name="_Toc242456228"/>
       <w:r>
         <w:rPr>
           <w:rFonts w:asciiTheme="minorHAnsi" w:eastAsia="Times New Roman" w:hAnsiTheme="minorHAnsi" w:cstheme="minorHAnsi"/>
@@ -10357,7 +10357,7 @@
           <w:lang w:eastAsia="es-MX"/>
         </w:rPr>
       </w:pPr>
-      <w:bookmarkStart w:id="16" w:name="_Toc241765582"/>
+      <w:bookmarkStart w:id="16" w:name="_Toc242456229"/>
       <w:r>
         <w:rPr>
           <w:rFonts w:asciiTheme="minorHAnsi" w:eastAsia="Times New Roman" w:hAnsiTheme="minorHAnsi" w:cstheme="minorHAnsi"/>
@@ -10605,7 +10605,7 @@
           <w:lang w:eastAsia="es-MX"/>
         </w:rPr>
       </w:pPr>
-      <w:bookmarkStart w:id="17" w:name="_Toc241765583"/>
+      <w:bookmarkStart w:id="17" w:name="_Toc242456230"/>
       <w:r>
         <w:rPr>
           <w:rFonts w:asciiTheme="minorHAnsi" w:eastAsia="Times New Roman" w:hAnsiTheme="minorHAnsi" w:cstheme="minorHAnsi"/>
@@ -10725,7 +10725,7 @@
           <w:rFonts w:asciiTheme="minorHAnsi" w:hAnsiTheme="minorHAnsi" w:cstheme="minorHAnsi"/>
         </w:rPr>
       </w:pPr>
-      <w:bookmarkStart w:id="18" w:name="_Toc241765584"/>
+      <w:bookmarkStart w:id="18" w:name="_Toc242456231"/>
       <w:r>
         <w:rPr>
           <w:rFonts w:asciiTheme="minorHAnsi" w:hAnsiTheme="minorHAnsi" w:cstheme="minorHAnsi"/>
@@ -13972,7 +13972,7 @@
           <w:rFonts w:asciiTheme="minorHAnsi" w:hAnsiTheme="minorHAnsi" w:cstheme="minorHAnsi"/>
         </w:rPr>
       </w:pPr>
-      <w:bookmarkStart w:id="38" w:name="_Toc241765585"/>
+      <w:bookmarkStart w:id="38" w:name="_Toc242456232"/>
       <w:r>
         <w:rPr>
           <w:rFonts w:asciiTheme="minorHAnsi" w:hAnsiTheme="minorHAnsi" w:cstheme="minorHAnsi"/>
@@ -16776,7 +16776,7 @@
           <w:rFonts w:asciiTheme="minorHAnsi" w:hAnsiTheme="minorHAnsi" w:cstheme="minorHAnsi"/>
         </w:rPr>
       </w:pPr>
-      <w:bookmarkStart w:id="39" w:name="_Toc241765586"/>
+      <w:bookmarkStart w:id="39" w:name="_Toc242456233"/>
       <w:r>
         <w:rPr>
           <w:rFonts w:asciiTheme="minorHAnsi" w:hAnsiTheme="minorHAnsi" w:cstheme="minorHAnsi"/>
@@ -21877,7 +21877,7 @@
           <w:rFonts w:asciiTheme="minorHAnsi" w:hAnsiTheme="minorHAnsi" w:cstheme="minorHAnsi"/>
         </w:rPr>
       </w:pPr>
-      <w:bookmarkStart w:id="40" w:name="_Toc241765587"/>
+      <w:bookmarkStart w:id="40" w:name="_Toc242456234"/>
       <w:r>
         <w:rPr>
           <w:rFonts w:asciiTheme="minorHAnsi" w:hAnsiTheme="minorHAnsi" w:cstheme="minorHAnsi"/>
@@ -21885,20 +21885,20 @@
         <w:lastRenderedPageBreak/>
         <w:t>Diagramas Caso De Uso</w:t>
       </w:r>
+      <w:r>
+        <w:rPr>
+          <w:rFonts w:asciiTheme="minorHAnsi" w:hAnsiTheme="minorHAnsi" w:cstheme="minorHAnsi"/>
+        </w:rPr>
+        <w:t xml:space="preserve"> y </w:t>
+      </w:r>
+      <w:proofErr w:type="spellStart"/>
+      <w:r>
+        <w:rPr>
+          <w:rFonts w:asciiTheme="minorHAnsi" w:hAnsiTheme="minorHAnsi" w:cstheme="minorHAnsi"/>
+        </w:rPr>
+        <w:t>documentacion</w:t>
+      </w:r>
       <w:bookmarkEnd w:id="40"/>
-      <w:r>
-        <w:rPr>
-          <w:rFonts w:asciiTheme="minorHAnsi" w:hAnsiTheme="minorHAnsi" w:cstheme="minorHAnsi"/>
-        </w:rPr>
-        <w:t xml:space="preserve"> y </w:t>
-      </w:r>
-      <w:proofErr w:type="spellStart"/>
-      <w:r>
-        <w:rPr>
-          <w:rFonts w:asciiTheme="minorHAnsi" w:hAnsiTheme="minorHAnsi" w:cstheme="minorHAnsi"/>
-        </w:rPr>
-        <w:t>documentacion</w:t>
-      </w:r>
       <w:proofErr w:type="spellEnd"/>
     </w:p>
     <w:p>
@@ -33703,7 +33703,7 @@
           <w:rFonts w:asciiTheme="minorHAnsi" w:hAnsiTheme="minorHAnsi" w:cstheme="minorHAnsi"/>
         </w:rPr>
       </w:pPr>
-      <w:bookmarkStart w:id="41" w:name="_Toc241765588"/>
+      <w:bookmarkStart w:id="41" w:name="_Toc242456235"/>
       <w:r>
         <w:rPr>
           <w:rFonts w:asciiTheme="minorHAnsi" w:hAnsiTheme="minorHAnsi" w:cstheme="minorHAnsi"/>
@@ -34214,7 +34214,7 @@
           <w:rFonts w:asciiTheme="minorHAnsi" w:hAnsiTheme="minorHAnsi" w:cstheme="minorHAnsi"/>
         </w:rPr>
       </w:pPr>
-      <w:bookmarkStart w:id="42" w:name="_Toc241765589"/>
+      <w:bookmarkStart w:id="42" w:name="_Toc242456236"/>
       <w:r>
         <w:rPr>
           <w:rFonts w:asciiTheme="minorHAnsi" w:hAnsiTheme="minorHAnsi" w:cstheme="minorHAnsi"/>
@@ -34311,7 +34311,7 @@
           <w:rFonts w:asciiTheme="minorHAnsi" w:hAnsiTheme="minorHAnsi" w:cstheme="minorHAnsi"/>
         </w:rPr>
       </w:pPr>
-      <w:bookmarkStart w:id="43" w:name="_Toc241765590"/>
+      <w:bookmarkStart w:id="43" w:name="_Toc242456237"/>
       <w:r>
         <w:rPr>
           <w:rFonts w:asciiTheme="minorHAnsi" w:hAnsiTheme="minorHAnsi" w:cstheme="minorHAnsi"/>
@@ -34344,7 +34344,7 @@
           <w:rFonts w:asciiTheme="minorHAnsi" w:hAnsiTheme="minorHAnsi" w:cstheme="minorHAnsi"/>
         </w:rPr>
       </w:pPr>
-      <w:bookmarkStart w:id="44" w:name="_Toc241765591"/>
+      <w:bookmarkStart w:id="44" w:name="_Toc242456238"/>
       <w:r>
         <w:rPr>
           <w:rFonts w:asciiTheme="minorHAnsi" w:hAnsiTheme="minorHAnsi" w:cstheme="minorHAnsi"/>
@@ -34366,7 +34366,7 @@
           <w:u w:val="single"/>
         </w:rPr>
       </w:pPr>
-      <w:bookmarkStart w:id="45" w:name="_Toc241765592"/>
+      <w:bookmarkStart w:id="45" w:name="_Toc242456239"/>
       <w:r>
         <w:rPr>
           <w:rFonts w:asciiTheme="minorHAnsi" w:hAnsiTheme="minorHAnsi" w:cstheme="minorHAnsi"/>
@@ -34447,7 +34447,7 @@
           <w:u w:val="single"/>
         </w:rPr>
       </w:pPr>
-      <w:bookmarkStart w:id="46" w:name="_Toc241765593"/>
+      <w:bookmarkStart w:id="46" w:name="_Toc242456240"/>
       <w:r>
         <w:rPr>
           <w:rFonts w:asciiTheme="minorHAnsi" w:hAnsiTheme="minorHAnsi" w:cstheme="minorHAnsi"/>
@@ -34655,7 +34655,7 @@
           <w:u w:val="single"/>
         </w:rPr>
       </w:pPr>
-      <w:bookmarkStart w:id="47" w:name="_Toc241765594"/>
+      <w:bookmarkStart w:id="47" w:name="_Toc242456241"/>
       <w:r>
         <w:rPr>
           <w:rFonts w:asciiTheme="minorHAnsi" w:hAnsiTheme="minorHAnsi" w:cstheme="minorHAnsi"/>
@@ -34701,7 +34701,7 @@
           <w:u w:val="single"/>
         </w:rPr>
       </w:pPr>
-      <w:bookmarkStart w:id="48" w:name="_Toc241765595"/>
+      <w:bookmarkStart w:id="48" w:name="_Toc242456242"/>
       <w:r>
         <w:rPr>
           <w:rFonts w:asciiTheme="minorHAnsi" w:hAnsiTheme="minorHAnsi" w:cstheme="minorHAnsi"/>
@@ -34829,7 +34829,7 @@
           <w:u w:val="single"/>
         </w:rPr>
       </w:pPr>
-      <w:bookmarkStart w:id="49" w:name="_Toc241765596"/>
+      <w:bookmarkStart w:id="49" w:name="_Toc242456243"/>
       <w:r>
         <w:rPr>
           <w:rFonts w:asciiTheme="minorHAnsi" w:hAnsiTheme="minorHAnsi" w:cstheme="minorHAnsi"/>
@@ -34874,7 +34874,7 @@
           <w:u w:val="single"/>
         </w:rPr>
       </w:pPr>
-      <w:bookmarkStart w:id="50" w:name="_Toc241765597"/>
+      <w:bookmarkStart w:id="50" w:name="_Toc242456244"/>
       <w:r>
         <w:rPr>
           <w:rFonts w:asciiTheme="minorHAnsi" w:hAnsiTheme="minorHAnsi" w:cstheme="minorHAnsi"/>
@@ -35069,7 +35069,7 @@
           <w:u w:val="single"/>
         </w:rPr>
       </w:pPr>
-      <w:bookmarkStart w:id="51" w:name="_Toc241765598"/>
+      <w:bookmarkStart w:id="51" w:name="_Toc242456245"/>
       <w:r>
         <w:rPr>
           <w:rFonts w:asciiTheme="minorHAnsi" w:hAnsiTheme="minorHAnsi" w:cstheme="minorHAnsi"/>
@@ -35114,7 +35114,7 @@
           <w:u w:val="single"/>
         </w:rPr>
       </w:pPr>
-      <w:bookmarkStart w:id="52" w:name="_Toc241765599"/>
+      <w:bookmarkStart w:id="52" w:name="_Toc242456246"/>
       <w:r>
         <w:rPr>
           <w:rFonts w:asciiTheme="minorHAnsi" w:hAnsiTheme="minorHAnsi" w:cstheme="minorHAnsi"/>
@@ -35227,7 +35227,7 @@
           <w:u w:val="single"/>
         </w:rPr>
       </w:pPr>
-      <w:bookmarkStart w:id="53" w:name="_Toc241765600"/>
+      <w:bookmarkStart w:id="53" w:name="_Toc242456247"/>
       <w:r>
         <w:rPr>
           <w:rFonts w:asciiTheme="minorHAnsi" w:hAnsiTheme="minorHAnsi" w:cstheme="minorHAnsi"/>
@@ -35272,7 +35272,7 @@
           <w:u w:val="single"/>
         </w:rPr>
       </w:pPr>
-      <w:bookmarkStart w:id="54" w:name="_Toc241765601"/>
+      <w:bookmarkStart w:id="54" w:name="_Toc242456248"/>
       <w:r>
         <w:rPr>
           <w:rFonts w:asciiTheme="minorHAnsi" w:hAnsiTheme="minorHAnsi" w:cstheme="minorHAnsi"/>
@@ -35417,7 +35417,7 @@
           <w:u w:val="single"/>
         </w:rPr>
       </w:pPr>
-      <w:bookmarkStart w:id="55" w:name="_Toc241765602"/>
+      <w:bookmarkStart w:id="55" w:name="_Toc242456249"/>
       <w:r>
         <w:rPr>
           <w:rFonts w:asciiTheme="minorHAnsi" w:hAnsiTheme="minorHAnsi" w:cstheme="minorHAnsi"/>
@@ -35565,7 +35565,7 @@
       <w:pPr>
         <w:pStyle w:val="Ttulo1"/>
       </w:pPr>
-      <w:bookmarkStart w:id="56" w:name="_Toc241765603"/>
+      <w:bookmarkStart w:id="56" w:name="_Toc242456250"/>
       <w:r>
         <w:t>2. Estructura del Código</w:t>
       </w:r>
@@ -35585,7 +35585,7 @@
           <w:u w:val="single"/>
         </w:rPr>
       </w:pPr>
-      <w:bookmarkStart w:id="57" w:name="_Toc241765604"/>
+      <w:bookmarkStart w:id="57" w:name="_Toc242456251"/>
       <w:r>
         <w:rPr>
           <w:rFonts w:asciiTheme="minorHAnsi" w:hAnsiTheme="minorHAnsi" w:cstheme="minorHAnsi"/>
@@ -35661,7 +35661,7 @@
           <w:u w:val="single"/>
         </w:rPr>
       </w:pPr>
-      <w:bookmarkStart w:id="58" w:name="_Toc241765605"/>
+      <w:bookmarkStart w:id="58" w:name="_Toc242456252"/>
       <w:r>
         <w:rPr>
           <w:rFonts w:asciiTheme="minorHAnsi" w:hAnsiTheme="minorHAnsi" w:cstheme="minorHAnsi"/>
@@ -35873,7 +35873,7 @@
           <w:u w:val="single"/>
         </w:rPr>
       </w:pPr>
-      <w:bookmarkStart w:id="59" w:name="_Toc241765606"/>
+      <w:bookmarkStart w:id="59" w:name="_Toc242456253"/>
       <w:r>
         <w:rPr>
           <w:rFonts w:asciiTheme="minorHAnsi" w:hAnsiTheme="minorHAnsi" w:cstheme="minorHAnsi"/>
@@ -35937,7 +35937,7 @@
           <w:u w:val="single"/>
         </w:rPr>
       </w:pPr>
-      <w:bookmarkStart w:id="60" w:name="_Toc241765607"/>
+      <w:bookmarkStart w:id="60" w:name="_Toc242456254"/>
       <w:r>
         <w:rPr>
           <w:rFonts w:asciiTheme="minorHAnsi" w:hAnsiTheme="minorHAnsi" w:cstheme="minorHAnsi"/>
@@ -36144,7 +36144,7 @@
       <w:pPr>
         <w:pStyle w:val="Ttulo1"/>
       </w:pPr>
-      <w:bookmarkStart w:id="61" w:name="_Toc241765608"/>
+      <w:bookmarkStart w:id="61" w:name="_Toc242456255"/>
       <w:r>
         <w:lastRenderedPageBreak/>
         <w:t>3. Control de Versiones</w:t>
@@ -36237,7 +36237,7 @@
       <w:pPr>
         <w:pStyle w:val="Ttulo1"/>
       </w:pPr>
-      <w:bookmarkStart w:id="62" w:name="_Toc241765609"/>
+      <w:bookmarkStart w:id="62" w:name="_Toc242456256"/>
       <w:r>
         <w:t>4. Seguridad en el Desarrollo</w:t>
       </w:r>
@@ -36256,7 +36256,7 @@
           <w:u w:val="single"/>
         </w:rPr>
       </w:pPr>
-      <w:bookmarkStart w:id="63" w:name="_Toc241765610"/>
+      <w:bookmarkStart w:id="63" w:name="_Toc242456257"/>
       <w:r>
         <w:rPr>
           <w:rFonts w:asciiTheme="minorHAnsi" w:hAnsiTheme="minorHAnsi" w:cstheme="minorHAnsi"/>
@@ -36365,7 +36365,7 @@
           <w:u w:val="single"/>
         </w:rPr>
       </w:pPr>
-      <w:bookmarkStart w:id="64" w:name="_Toc241765611"/>
+      <w:bookmarkStart w:id="64" w:name="_Toc242456258"/>
       <w:r>
         <w:rPr>
           <w:rFonts w:asciiTheme="minorHAnsi" w:hAnsiTheme="minorHAnsi" w:cstheme="minorHAnsi"/>
@@ -36578,7 +36578,7 @@
       <w:pPr>
         <w:pStyle w:val="Ttulo1"/>
       </w:pPr>
-      <w:bookmarkStart w:id="65" w:name="_Toc241765612"/>
+      <w:bookmarkStart w:id="65" w:name="_Toc242456259"/>
       <w:r>
         <w:t>5. Pruebas y Validación</w:t>
       </w:r>
@@ -36597,7 +36597,7 @@
           <w:u w:val="single"/>
         </w:rPr>
       </w:pPr>
-      <w:bookmarkStart w:id="66" w:name="_Toc241765613"/>
+      <w:bookmarkStart w:id="66" w:name="_Toc242456260"/>
       <w:r>
         <w:rPr>
           <w:rFonts w:asciiTheme="minorHAnsi" w:hAnsiTheme="minorHAnsi" w:cstheme="minorHAnsi"/>
@@ -36697,7 +36697,7 @@
           <w:u w:val="single"/>
         </w:rPr>
       </w:pPr>
-      <w:bookmarkStart w:id="67" w:name="_Toc241765614"/>
+      <w:bookmarkStart w:id="67" w:name="_Toc242456261"/>
       <w:r>
         <w:rPr>
           <w:rFonts w:asciiTheme="minorHAnsi" w:hAnsiTheme="minorHAnsi" w:cstheme="minorHAnsi"/>
@@ -36844,7 +36844,7 @@
       <w:pPr>
         <w:pStyle w:val="Ttulo1"/>
       </w:pPr>
-      <w:bookmarkStart w:id="68" w:name="_Toc241765615"/>
+      <w:bookmarkStart w:id="68" w:name="_Toc242456262"/>
       <w:r>
         <w:t>6. Estructura de archivos y Directorios</w:t>
       </w:r>
@@ -36863,7 +36863,7 @@
           <w:u w:val="single"/>
         </w:rPr>
       </w:pPr>
-      <w:bookmarkStart w:id="69" w:name="_Toc241765616"/>
+      <w:bookmarkStart w:id="69" w:name="_Toc242456263"/>
       <w:r>
         <w:rPr>
           <w:rFonts w:asciiTheme="minorHAnsi" w:hAnsiTheme="minorHAnsi" w:cstheme="minorHAnsi"/>
@@ -36965,7 +36965,7 @@
       <w:pPr>
         <w:pStyle w:val="Ttulo1"/>
       </w:pPr>
-      <w:bookmarkStart w:id="70" w:name="_Toc241765617"/>
+      <w:bookmarkStart w:id="70" w:name="_Toc242456264"/>
       <w:r>
         <w:t xml:space="preserve">7. Uso de </w:t>
       </w:r>
@@ -36992,7 +36992,7 @@
           <w:u w:val="single"/>
         </w:rPr>
       </w:pPr>
-      <w:bookmarkStart w:id="71" w:name="_Toc241765618"/>
+      <w:bookmarkStart w:id="71" w:name="_Toc242456265"/>
       <w:r>
         <w:rPr>
           <w:rFonts w:asciiTheme="minorHAnsi" w:hAnsiTheme="minorHAnsi" w:cstheme="minorHAnsi"/>
@@ -37104,7 +37104,7 @@
           <w:u w:val="single"/>
         </w:rPr>
       </w:pPr>
-      <w:bookmarkStart w:id="72" w:name="_Toc241765619"/>
+      <w:bookmarkStart w:id="72" w:name="_Toc242456266"/>
       <w:r>
         <w:rPr>
           <w:rFonts w:asciiTheme="minorHAnsi" w:hAnsiTheme="minorHAnsi" w:cstheme="minorHAnsi"/>
@@ -37291,7 +37291,7 @@
       <w:pPr>
         <w:pStyle w:val="Ttulo1"/>
       </w:pPr>
-      <w:bookmarkStart w:id="73" w:name="_Toc241765620"/>
+      <w:bookmarkStart w:id="73" w:name="_Toc242456267"/>
       <w:r>
         <w:t xml:space="preserve">8. Estándares de Codificación en </w:t>
       </w:r>
@@ -37315,7 +37315,7 @@
           <w:u w:val="single"/>
         </w:rPr>
       </w:pPr>
-      <w:bookmarkStart w:id="74" w:name="_Toc241765621"/>
+      <w:bookmarkStart w:id="74" w:name="_Toc242456268"/>
       <w:r>
         <w:rPr>
           <w:rFonts w:asciiTheme="minorHAnsi" w:hAnsiTheme="minorHAnsi" w:cstheme="minorHAnsi"/>
@@ -37514,7 +37514,7 @@
           <w:u w:val="single"/>
         </w:rPr>
       </w:pPr>
-      <w:bookmarkStart w:id="75" w:name="_Toc241765622"/>
+      <w:bookmarkStart w:id="75" w:name="_Toc242456269"/>
       <w:r>
         <w:rPr>
           <w:rFonts w:asciiTheme="minorHAnsi" w:hAnsiTheme="minorHAnsi" w:cstheme="minorHAnsi"/>
@@ -37682,7 +37682,7 @@
       <w:pPr>
         <w:pStyle w:val="Ttulo1"/>
       </w:pPr>
-      <w:bookmarkStart w:id="76" w:name="_Toc241765623"/>
+      <w:bookmarkStart w:id="76" w:name="_Toc242456270"/>
       <w:r>
         <w:t xml:space="preserve">9. Estándares de Codificación en </w:t>
       </w:r>
@@ -37706,7 +37706,7 @@
           <w:u w:val="single"/>
         </w:rPr>
       </w:pPr>
-      <w:bookmarkStart w:id="77" w:name="_Toc241765624"/>
+      <w:bookmarkStart w:id="77" w:name="_Toc242456271"/>
       <w:r>
         <w:rPr>
           <w:rFonts w:asciiTheme="minorHAnsi" w:hAnsiTheme="minorHAnsi" w:cstheme="minorHAnsi"/>
@@ -37805,7 +37805,7 @@
           <w:u w:val="single"/>
         </w:rPr>
       </w:pPr>
-      <w:bookmarkStart w:id="78" w:name="_Toc241765625"/>
+      <w:bookmarkStart w:id="78" w:name="_Toc242456272"/>
       <w:r>
         <w:rPr>
           <w:rFonts w:asciiTheme="minorHAnsi" w:hAnsiTheme="minorHAnsi" w:cstheme="minorHAnsi"/>
@@ -37946,7 +37946,7 @@
       <w:pPr>
         <w:pStyle w:val="Ttulo1"/>
       </w:pPr>
-      <w:bookmarkStart w:id="79" w:name="_Toc241765626"/>
+      <w:bookmarkStart w:id="79" w:name="_Toc242456273"/>
       <w:r>
         <w:t>10. Uso de logs y Registros de Errores</w:t>
       </w:r>
@@ -37965,7 +37965,7 @@
           <w:u w:val="single"/>
         </w:rPr>
       </w:pPr>
-      <w:bookmarkStart w:id="80" w:name="_Toc241765627"/>
+      <w:bookmarkStart w:id="80" w:name="_Toc242456274"/>
       <w:r>
         <w:rPr>
           <w:rFonts w:asciiTheme="minorHAnsi" w:hAnsiTheme="minorHAnsi" w:cstheme="minorHAnsi"/>
@@ -38150,7 +38150,7 @@
           <w:szCs w:val="24"/>
         </w:rPr>
       </w:pPr>
-      <w:bookmarkStart w:id="81" w:name="_Toc241765628"/>
+      <w:bookmarkStart w:id="81" w:name="_Toc242456275"/>
       <w:r>
         <w:rPr>
           <w:rFonts w:asciiTheme="minorHAnsi" w:hAnsiTheme="minorHAnsi" w:cstheme="minorHAnsi"/>
@@ -38385,7 +38385,7 @@
       <w:pPr>
         <w:pStyle w:val="Ttulo1"/>
       </w:pPr>
-      <w:bookmarkStart w:id="82" w:name="_Toc241765629"/>
+      <w:bookmarkStart w:id="82" w:name="_Toc242456276"/>
       <w:r>
         <w:t>11. Configuración y Gestión de Errores</w:t>
       </w:r>
@@ -38404,7 +38404,7 @@
           <w:u w:val="single"/>
         </w:rPr>
       </w:pPr>
-      <w:bookmarkStart w:id="83" w:name="_Toc241765630"/>
+      <w:bookmarkStart w:id="83" w:name="_Toc242456277"/>
       <w:r>
         <w:rPr>
           <w:rFonts w:asciiTheme="minorHAnsi" w:hAnsiTheme="minorHAnsi" w:cstheme="minorHAnsi"/>
@@ -38484,7 +38484,7 @@
       <w:pPr>
         <w:pStyle w:val="Ttulo1"/>
       </w:pPr>
-      <w:bookmarkStart w:id="84" w:name="_Toc241765631"/>
+      <w:bookmarkStart w:id="84" w:name="_Toc242456278"/>
       <w:r>
         <w:t xml:space="preserve">12. Estándares para </w:t>
       </w:r>
@@ -38511,7 +38511,7 @@
           <w:u w:val="single"/>
         </w:rPr>
       </w:pPr>
-      <w:bookmarkStart w:id="85" w:name="_Toc241765632"/>
+      <w:bookmarkStart w:id="85" w:name="_Toc242456279"/>
       <w:r>
         <w:rPr>
           <w:rFonts w:asciiTheme="minorHAnsi" w:hAnsiTheme="minorHAnsi" w:cstheme="minorHAnsi"/>
@@ -38759,7 +38759,7 @@
           <w:u w:val="single"/>
         </w:rPr>
       </w:pPr>
-      <w:bookmarkStart w:id="86" w:name="_Toc241765633"/>
+      <w:bookmarkStart w:id="86" w:name="_Toc242456280"/>
       <w:r>
         <w:rPr>
           <w:rFonts w:asciiTheme="minorHAnsi" w:hAnsiTheme="minorHAnsi" w:cstheme="minorHAnsi"/>
@@ -38874,7 +38874,7 @@
           <w:u w:val="single"/>
         </w:rPr>
       </w:pPr>
-      <w:bookmarkStart w:id="87" w:name="_Toc241765634"/>
+      <w:bookmarkStart w:id="87" w:name="_Toc242456281"/>
       <w:r>
         <w:rPr>
           <w:rFonts w:asciiTheme="minorHAnsi" w:hAnsiTheme="minorHAnsi" w:cstheme="minorHAnsi"/>
@@ -39034,7 +39034,7 @@
           <w:u w:val="single"/>
         </w:rPr>
       </w:pPr>
-      <w:bookmarkStart w:id="88" w:name="_Toc241765635"/>
+      <w:bookmarkStart w:id="88" w:name="_Toc242456282"/>
       <w:r>
         <w:rPr>
           <w:rFonts w:asciiTheme="minorHAnsi" w:hAnsiTheme="minorHAnsi" w:cstheme="minorHAnsi"/>
@@ -39276,7 +39276,7 @@
       <w:pPr>
         <w:pStyle w:val="Ttulo1"/>
       </w:pPr>
-      <w:bookmarkStart w:id="89" w:name="_Toc241765636"/>
+      <w:bookmarkStart w:id="89" w:name="_Toc242456283"/>
       <w:r>
         <w:t>13. Gestión de Errores y Excepciones</w:t>
       </w:r>
@@ -39295,7 +39295,7 @@
           <w:u w:val="single"/>
         </w:rPr>
       </w:pPr>
-      <w:bookmarkStart w:id="90" w:name="_Toc241765637"/>
+      <w:bookmarkStart w:id="90" w:name="_Toc242456284"/>
       <w:r>
         <w:rPr>
           <w:rFonts w:asciiTheme="minorHAnsi" w:hAnsiTheme="minorHAnsi" w:cstheme="minorHAnsi"/>
@@ -39516,7 +39516,7 @@
       <w:pPr>
         <w:pStyle w:val="Ttulo1"/>
       </w:pPr>
-      <w:bookmarkStart w:id="91" w:name="_Toc241765638"/>
+      <w:bookmarkStart w:id="91" w:name="_Toc242456285"/>
       <w:r>
         <w:t>14. Gestión de Dependencias y Versionados</w:t>
       </w:r>
@@ -39535,7 +39535,7 @@
           <w:u w:val="single"/>
         </w:rPr>
       </w:pPr>
-      <w:bookmarkStart w:id="92" w:name="_Toc241765639"/>
+      <w:bookmarkStart w:id="92" w:name="_Toc242456286"/>
       <w:r>
         <w:rPr>
           <w:rFonts w:asciiTheme="minorHAnsi" w:hAnsiTheme="minorHAnsi" w:cstheme="minorHAnsi"/>

</xml_diff>

<commit_message>
modified:   Documentacion Panel CS/Documento IEEE.docx
</commit_message>
<xml_diff>
--- a/Documentacion Panel CS/Documentacion Panel CS.docx
+++ b/Documentacion Panel CS/Documentacion Panel CS.docx
@@ -6649,8 +6649,8 @@
         <w:tblLook w:val="04A0" w:firstRow="1" w:lastRow="0" w:firstColumn="1" w:lastColumn="0" w:noHBand="0" w:noVBand="1"/>
       </w:tblPr>
       <w:tblGrid>
-        <w:gridCol w:w="2007"/>
-        <w:gridCol w:w="7019"/>
+        <w:gridCol w:w="1974"/>
+        <w:gridCol w:w="7052"/>
       </w:tblGrid>
       <w:tr>
         <w:tc>
@@ -6719,7 +6719,6 @@
                 <w:lang w:eastAsia="es-MX"/>
               </w:rPr>
             </w:pPr>
-            <w:proofErr w:type="spellStart"/>
             <w:r>
               <w:rPr>
                 <w:rFonts w:eastAsia="Times New Roman" w:cstheme="minorHAnsi"/>
@@ -6728,9 +6727,18 @@
                 <w:szCs w:val="24"/>
                 <w:lang w:eastAsia="es-MX"/>
               </w:rPr>
-              <w:t>Brandom</w:t>
-            </w:r>
-            <w:proofErr w:type="spellEnd"/>
+              <w:t>Brando</w:t>
+            </w:r>
+            <w:r>
+              <w:rPr>
+                <w:rFonts w:eastAsia="Times New Roman" w:cstheme="minorHAnsi"/>
+                <w:color w:val="000000"/>
+                <w:sz w:val="24"/>
+                <w:szCs w:val="24"/>
+                <w:lang w:eastAsia="es-MX"/>
+              </w:rPr>
+              <w:t xml:space="preserve"> Alejandro Von Borstel Márquez</w:t>
+            </w:r>
           </w:p>
         </w:tc>
       </w:tr>
@@ -7024,17 +7032,7 @@
                 <w:lang w:eastAsia="es-MX"/>
               </w:rPr>
               <w:lastRenderedPageBreak/>
-              <w:t>implementación de los servicios y API necesarios para el funcionamiento de</w:t>
-            </w:r>
-            <w:r>
-              <w:rPr>
-                <w:rFonts w:eastAsia="Times New Roman" w:cstheme="minorHAnsi"/>
-                <w:color w:val="000000"/>
-                <w:sz w:val="24"/>
-                <w:szCs w:val="24"/>
-                <w:lang w:eastAsia="es-MX"/>
-              </w:rPr>
-              <w:t>l sistema</w:t>
+              <w:t>implementación de los servicios y API necesarios para el funcionamiento del sistema</w:t>
             </w:r>
           </w:p>
         </w:tc>
@@ -7106,6 +7104,15 @@
                 <w:lang w:eastAsia="es-MX"/>
               </w:rPr>
             </w:pPr>
+            <w:r>
+              <w:rPr>
+                <w:rFonts w:eastAsia="Times New Roman" w:cstheme="minorHAnsi"/>
+                <w:sz w:val="24"/>
+                <w:szCs w:val="24"/>
+                <w:lang w:eastAsia="es-MX"/>
+              </w:rPr>
+              <w:t>Brandonvon19@gmail.com</w:t>
+            </w:r>
           </w:p>
         </w:tc>
       </w:tr>
@@ -7832,24 +7839,6 @@
           <w:szCs w:val="24"/>
         </w:rPr>
         <w:t>A diferencia de los sistemas empresariales monolíticos (como un ERP completo), este producto está altamente especializado en la orquestación, personalización y despacho de mensajería, dependiendo de interfaces externas para su funcionamiento principal.</w:t>
-      </w:r>
-    </w:p>
-    <w:p>
-      <w:pPr>
-        <w:jc w:val="both"/>
-        <w:rPr>
-          <w:rFonts w:cstheme="minorHAnsi"/>
-          <w:sz w:val="24"/>
-          <w:szCs w:val="24"/>
-        </w:rPr>
-      </w:pPr>
-      <w:r>
-        <w:rPr>
-          <w:rFonts w:cstheme="minorHAnsi"/>
-          <w:sz w:val="24"/>
-          <w:szCs w:val="24"/>
-        </w:rPr>
-        <w:t>A continuación, se detallan las interfaces y el entorno operativo del producto:</w:t>
       </w:r>
     </w:p>
     <w:p>

</xml_diff>